<commit_message>
Rewrite the Blueprint Room overview around the storyline.
Ana walks a series episode or a new project through the beats, the cast, and Blueprint Director before the 90-minute script, so Production Stage does not have to rebuild it.

Co-authored-by: anderson0531 <anderson0531@users.noreply.github.com>
</commit_message>
<xml_diff>
--- a/Key-Features-video-scripts.docx
+++ b/Key-Features-video-scripts.docx
@@ -480,7 +480,7 @@
           <w:b w:val="0"/>
           <w:sz w:val="22"/>
         </w:rPr>
-        <w:t>One narrator for every film except the Series Room. A director finishing a picture, speaking to “you.” Warm, unhurried, no sales cadence. Land the short lines and let the picture carry the rest. Ana, the presenter from the hero, speaks the Series Room film. Same jacket, studio desk. The other three rooms keep this narrator.</w:t>
+        <w:t>One narrator for every film except the Series Room and the Blueprint Room. A director finishing a picture, speaking to “you.” Warm, unhurried, no sales cadence. Land the short lines and let the picture carry the rest. Ana, the presenter from the hero, speaks the Series Room and the Blueprint Room. Same jacket, studio desk. The other two rooms keep this narrator.</w:t>
       </w:r>
     </w:p>
     <w:p>
@@ -493,7 +493,7 @@
           <w:b w:val="0"/>
           <w:sz w:val="22"/>
         </w:rPr>
-        <w:t xml:space="preserve">Gemini voice: gemini-Rasalgethi. Director note: “You are in the room with the cut. You do not teach the screen.” The Series Room film is Ana, not this read.</w:t>
+        <w:t xml:space="preserve">Gemini voice: gemini-Rasalgethi. Director note: “You are in the room with the cut. You do not teach the screen.” The Series Room and the Blueprint Room are Ana, not this read.</w:t>
       </w:r>
       <w:r>
         <w:rPr>
@@ -1863,6 +1863,27 @@
     </w:p>
     <w:p>
       <w:pPr>
+        <w:spacing w:before="0" w:after="160" w:line="259" w:lineRule="auto"/>
+      </w:pPr>
+      <w:r>
+        <w:rPr>
+          <w:rFonts w:ascii="Calibri" w:hAnsi="Calibri" w:eastAsia="Calibri"/>
+          <w:b/>
+          <w:sz w:val="22"/>
+        </w:rPr>
+        <w:t>Voice: Ana, the presenter from the hero. Olive-green field jacket, slate turtleneck, studio desk, amber screen light. Warm and unhurried, about 150 words a minute. She speaks the open, then narrates the captures. She does not teach the screen. No cursor tour, no logo, no end card.</w:t>
+      </w:r>
+      <w:r>
+        <w:rPr>
+          <w:rFonts w:ascii="Calibri" w:hAnsi="Calibri" w:eastAsia="Calibri"/>
+          <w:b w:val="0"/>
+          <w:sz w:val="22"/>
+        </w:rPr>
+        <w:t xml:space="preserve"/>
+      </w:r>
+    </w:p>
+    <w:p>
+      <w:pPr>
         <w:pStyle w:val="Heading3"/>
         <w:spacing w:before="240" w:after="120"/>
       </w:pPr>
@@ -1870,7 +1891,7 @@
         <w:rPr>
           <w:color w:val="111827"/>
         </w:rPr>
-        <w:t>0:00–0:08 — Before a frame</w:t>
+        <w:t>0:00–0:08 — Ana</w:t>
       </w:r>
     </w:p>
     <w:p>
@@ -1884,15 +1905,15 @@
           <w:b/>
           <w:sz w:val="22"/>
         </w:rPr>
-        <w:t>Picture:</w:t>
-      </w:r>
-      <w:r>
-        <w:rPr>
-          <w:rFonts w:ascii="Calibri" w:hAnsi="Calibri" w:eastAsia="Calibri"/>
-          <w:b w:val="0"/>
-          <w:sz w:val="22"/>
-        </w:rPr>
-        <w:t xml:space="preserve"> Omni </w:t>
+        <w:t>Picture: Ana at the studio desk. Amber screen light on her face. She looks to camera. No interface and no readable screen. The first 8 seconds must read with the sound off.</w:t>
+      </w:r>
+      <w:r>
+        <w:rPr>
+          <w:rFonts w:ascii="Calibri" w:hAnsi="Calibri" w:eastAsia="Calibri"/>
+          <w:b w:val="0"/>
+          <w:sz w:val="22"/>
+        </w:rPr>
+        <w:t xml:space="preserve"/>
       </w:r>
       <w:r>
         <w:rPr>
@@ -1901,15 +1922,15 @@
           <w:color w:val="1E406E"/>
           <w:sz w:val="20"/>
         </w:rPr>
-        <w:t>omni-hold</w:t>
-      </w:r>
-      <w:r>
-        <w:rPr>
-          <w:rFonts w:ascii="Calibri" w:hAnsi="Calibri" w:eastAsia="Calibri"/>
-          <w:b w:val="0"/>
-          <w:sz w:val="22"/>
-        </w:rPr>
-        <w:t>, first 8 seconds. She is already the person the film will have to protect.</w:t>
+        <w:t/>
+      </w:r>
+      <w:r>
+        <w:rPr>
+          <w:rFonts w:ascii="Calibri" w:hAnsi="Calibri" w:eastAsia="Calibri"/>
+          <w:b w:val="0"/>
+          <w:sz w:val="22"/>
+        </w:rPr>
+        <w:t/>
       </w:r>
     </w:p>
     <w:p>
@@ -1923,15 +1944,32 @@
           <w:b/>
           <w:sz w:val="22"/>
         </w:rPr>
-        <w:t>Narration:</w:t>
-      </w:r>
-      <w:r>
-        <w:rPr>
-          <w:rFonts w:ascii="Calibri" w:hAnsi="Calibri" w:eastAsia="Calibri"/>
-          <w:b w:val="0"/>
-          <w:sz w:val="22"/>
-        </w:rPr>
-        <w:t xml:space="preserve"> This is her, before anyone spends on a picture.</w:t>
+        <w:t>Narration (from 0:02): Perfect the storyline here, before the 90-minute script. A series episode, or a new project. Production should not have to rebuild it.</w:t>
+      </w:r>
+      <w:r>
+        <w:rPr>
+          <w:rFonts w:ascii="Calibri" w:hAnsi="Calibri" w:eastAsia="Calibri"/>
+          <w:b w:val="0"/>
+          <w:sz w:val="22"/>
+        </w:rPr>
+        <w:t xml:space="preserve"/>
+      </w:r>
+      <w:r>
+        <w:rPr>
+          <w:rFonts w:ascii="Consolas" w:hAnsi="Consolas" w:eastAsia="Consolas"/>
+          <w:b w:val="0"/>
+          <w:color w:val="1E406E"/>
+          <w:sz w:val="20"/>
+        </w:rPr>
+        <w:t/>
+      </w:r>
+      <w:r>
+        <w:rPr>
+          <w:rFonts w:ascii="Calibri" w:hAnsi="Calibri" w:eastAsia="Calibri"/>
+          <w:b w:val="0"/>
+          <w:sz w:val="22"/>
+        </w:rPr>
+        <w:t/>
       </w:r>
     </w:p>
     <w:p>
@@ -1945,15 +1983,32 @@
           <w:b/>
           <w:sz w:val="22"/>
         </w:rPr>
-        <w:t>Words:</w:t>
-      </w:r>
-      <w:r>
-        <w:rPr>
-          <w:rFonts w:ascii="Calibri" w:hAnsi="Calibri" w:eastAsia="Calibri"/>
-          <w:b w:val="0"/>
-          <w:sz w:val="22"/>
-        </w:rPr>
-        <w:t xml:space="preserve"> 9</w:t>
+        <w:t>Words: 22</w:t>
+      </w:r>
+      <w:r>
+        <w:rPr>
+          <w:rFonts w:ascii="Calibri" w:hAnsi="Calibri" w:eastAsia="Calibri"/>
+          <w:b w:val="0"/>
+          <w:sz w:val="22"/>
+        </w:rPr>
+        <w:t xml:space="preserve"/>
+      </w:r>
+      <w:r>
+        <w:rPr>
+          <w:rFonts w:ascii="Consolas" w:hAnsi="Consolas" w:eastAsia="Consolas"/>
+          <w:b w:val="0"/>
+          <w:color w:val="1E406E"/>
+          <w:sz w:val="20"/>
+        </w:rPr>
+        <w:t/>
+      </w:r>
+      <w:r>
+        <w:rPr>
+          <w:rFonts w:ascii="Calibri" w:hAnsi="Calibri" w:eastAsia="Calibri"/>
+          <w:b w:val="0"/>
+          <w:sz w:val="22"/>
+        </w:rPr>
+        <w:t/>
       </w:r>
     </w:p>
     <w:p>
@@ -1965,7 +2020,7 @@
         <w:rPr>
           <w:color w:val="111827"/>
         </w:rPr>
-        <w:t>0:08–0:28 — One beat sheet</w:t>
+        <w:t>0:08–0:16 — Two ways in</w:t>
       </w:r>
     </w:p>
     <w:p>
@@ -1979,15 +2034,32 @@
           <w:b/>
           <w:sz w:val="22"/>
         </w:rPr>
-        <w:t>Picture:</w:t>
-      </w:r>
-      <w:r>
-        <w:rPr>
-          <w:rFonts w:ascii="Calibri" w:hAnsi="Calibri" w:eastAsia="Calibri"/>
-          <w:b w:val="0"/>
-          <w:sz w:val="22"/>
-        </w:rPr>
-        <w:t xml:space="preserve"> Capture. A sentence on the treatment becomes motivations, characters, art direction, and the beat sheet. Hold on the beats. Do not show a second list anywhere else.</w:t>
+        <w:t>Picture: Capture. A series episode already known: outline, synopsis, and beats attached. Cut to Start Your Project. The intent is in the description. Validate &amp; Enhance with AI, then Generate Blueprint. Cut when the treatment appears. No spinner.</w:t>
+      </w:r>
+      <w:r>
+        <w:rPr>
+          <w:rFonts w:ascii="Calibri" w:hAnsi="Calibri" w:eastAsia="Calibri"/>
+          <w:b w:val="0"/>
+          <w:sz w:val="22"/>
+        </w:rPr>
+        <w:t xml:space="preserve"/>
+      </w:r>
+      <w:r>
+        <w:rPr>
+          <w:rFonts w:ascii="Consolas" w:hAnsi="Consolas" w:eastAsia="Consolas"/>
+          <w:b w:val="0"/>
+          <w:color w:val="1E406E"/>
+          <w:sz w:val="20"/>
+        </w:rPr>
+        <w:t/>
+      </w:r>
+      <w:r>
+        <w:rPr>
+          <w:rFonts w:ascii="Calibri" w:hAnsi="Calibri" w:eastAsia="Calibri"/>
+          <w:b w:val="0"/>
+          <w:sz w:val="22"/>
+        </w:rPr>
+        <w:t/>
       </w:r>
     </w:p>
     <w:p>
@@ -2001,15 +2073,15 @@
           <w:b/>
           <w:sz w:val="22"/>
         </w:rPr>
-        <w:t>Still if needed:</w:t>
-      </w:r>
-      <w:r>
-        <w:rPr>
-          <w:rFonts w:ascii="Calibri" w:hAnsi="Calibri" w:eastAsia="Calibri"/>
-          <w:b w:val="0"/>
-          <w:sz w:val="22"/>
-        </w:rPr>
-        <w:t xml:space="preserve"> </w:t>
+        <w:t>Still if needed: Series episode already known, or Start Your Project — intent, Validate &amp; Enhance with AI, Generate Blueprint</w:t>
+      </w:r>
+      <w:r>
+        <w:rPr>
+          <w:rFonts w:ascii="Calibri" w:hAnsi="Calibri" w:eastAsia="Calibri"/>
+          <w:b w:val="0"/>
+          <w:sz w:val="22"/>
+        </w:rPr>
+        <w:t xml:space="preserve"/>
       </w:r>
       <w:r>
         <w:rPr>
@@ -2018,7 +2090,15 @@
           <w:color w:val="1E406E"/>
           <w:sz w:val="20"/>
         </w:rPr>
-        <w:t>Treatment board</w:t>
+        <w:t/>
+      </w:r>
+      <w:r>
+        <w:rPr>
+          <w:rFonts w:ascii="Calibri" w:hAnsi="Calibri" w:eastAsia="Calibri"/>
+          <w:b w:val="0"/>
+          <w:sz w:val="22"/>
+        </w:rPr>
+        <w:t/>
       </w:r>
     </w:p>
     <w:p>
@@ -2032,15 +2112,32 @@
           <w:b/>
           <w:sz w:val="22"/>
         </w:rPr>
-        <w:t>Narration:</w:t>
-      </w:r>
-      <w:r>
-        <w:rPr>
-          <w:rFonts w:ascii="Calibri" w:hAnsi="Calibri" w:eastAsia="Calibri"/>
-          <w:b w:val="0"/>
-          <w:sz w:val="22"/>
-        </w:rPr>
-        <w:t xml:space="preserve"> A sentence becomes the film. Who she is. Why she stays. How the rooms look. And one beat sheet. Beats live here. Later, each beat becomes a chapter. There is no second sheet.</w:t>
+        <w:t>Narration: Start from the episode you already have. Or from a new project. Say what you intend, then generate the blueprint.</w:t>
+      </w:r>
+      <w:r>
+        <w:rPr>
+          <w:rFonts w:ascii="Calibri" w:hAnsi="Calibri" w:eastAsia="Calibri"/>
+          <w:b w:val="0"/>
+          <w:sz w:val="22"/>
+        </w:rPr>
+        <w:t xml:space="preserve"/>
+      </w:r>
+      <w:r>
+        <w:rPr>
+          <w:rFonts w:ascii="Consolas" w:hAnsi="Consolas" w:eastAsia="Consolas"/>
+          <w:b w:val="0"/>
+          <w:color w:val="1E406E"/>
+          <w:sz w:val="20"/>
+        </w:rPr>
+        <w:t/>
+      </w:r>
+      <w:r>
+        <w:rPr>
+          <w:rFonts w:ascii="Calibri" w:hAnsi="Calibri" w:eastAsia="Calibri"/>
+          <w:b w:val="0"/>
+          <w:sz w:val="22"/>
+        </w:rPr>
+        <w:t/>
       </w:r>
     </w:p>
     <w:p>
@@ -2054,15 +2151,32 @@
           <w:b/>
           <w:sz w:val="22"/>
         </w:rPr>
-        <w:t>Words:</w:t>
-      </w:r>
-      <w:r>
-        <w:rPr>
-          <w:rFonts w:ascii="Calibri" w:hAnsi="Calibri" w:eastAsia="Calibri"/>
-          <w:b w:val="0"/>
-          <w:sz w:val="22"/>
-        </w:rPr>
-        <w:t xml:space="preserve"> 33</w:t>
+        <w:t>Words: 20</w:t>
+      </w:r>
+      <w:r>
+        <w:rPr>
+          <w:rFonts w:ascii="Calibri" w:hAnsi="Calibri" w:eastAsia="Calibri"/>
+          <w:b w:val="0"/>
+          <w:sz w:val="22"/>
+        </w:rPr>
+        <w:t xml:space="preserve"/>
+      </w:r>
+      <w:r>
+        <w:rPr>
+          <w:rFonts w:ascii="Consolas" w:hAnsi="Consolas" w:eastAsia="Consolas"/>
+          <w:b w:val="0"/>
+          <w:color w:val="1E406E"/>
+          <w:sz w:val="20"/>
+        </w:rPr>
+        <w:t/>
+      </w:r>
+      <w:r>
+        <w:rPr>
+          <w:rFonts w:ascii="Calibri" w:hAnsi="Calibri" w:eastAsia="Calibri"/>
+          <w:b w:val="0"/>
+          <w:sz w:val="22"/>
+        </w:rPr>
+        <w:t/>
       </w:r>
     </w:p>
     <w:p>
@@ -2074,7 +2188,7 @@
         <w:rPr>
           <w:color w:val="111827"/>
         </w:rPr>
-        <w:t>0:28–0:46 — Score it before the spend</w:t>
+        <w:t>0:16–0:32 — Direct the beats</w:t>
       </w:r>
     </w:p>
     <w:p>
@@ -2088,15 +2202,32 @@
           <w:b/>
           <w:sz w:val="22"/>
         </w:rPr>
-        <w:t>Picture:</w:t>
-      </w:r>
-      <w:r>
-        <w:rPr>
-          <w:rFonts w:ascii="Calibri" w:hAnsi="Calibri" w:eastAsia="Calibri"/>
-          <w:b w:val="0"/>
-          <w:sz w:val="22"/>
-        </w:rPr>
-        <w:t xml:space="preserve"> Capture. Audience Resonance scores concept, tone, characters, and beats against the audience named on the board. Recommendations appear. Nothing rewrites itself.</w:t>
+        <w:t>Picture: Capture. The Beats tab, held. Listen is on. One beat sheet. Do not show a second list.</w:t>
+      </w:r>
+      <w:r>
+        <w:rPr>
+          <w:rFonts w:ascii="Calibri" w:hAnsi="Calibri" w:eastAsia="Calibri"/>
+          <w:b w:val="0"/>
+          <w:sz w:val="22"/>
+        </w:rPr>
+        <w:t xml:space="preserve"/>
+      </w:r>
+      <w:r>
+        <w:rPr>
+          <w:rFonts w:ascii="Consolas" w:hAnsi="Consolas" w:eastAsia="Consolas"/>
+          <w:b w:val="0"/>
+          <w:color w:val="1E406E"/>
+          <w:sz w:val="20"/>
+        </w:rPr>
+        <w:t/>
+      </w:r>
+      <w:r>
+        <w:rPr>
+          <w:rFonts w:ascii="Calibri" w:hAnsi="Calibri" w:eastAsia="Calibri"/>
+          <w:b w:val="0"/>
+          <w:sz w:val="22"/>
+        </w:rPr>
+        <w:t/>
       </w:r>
     </w:p>
     <w:p>
@@ -2110,15 +2241,15 @@
           <w:b/>
           <w:sz w:val="22"/>
         </w:rPr>
-        <w:t>Still if needed:</w:t>
-      </w:r>
-      <w:r>
-        <w:rPr>
-          <w:rFonts w:ascii="Calibri" w:hAnsi="Calibri" w:eastAsia="Calibri"/>
-          <w:b w:val="0"/>
-          <w:sz w:val="22"/>
-        </w:rPr>
-        <w:t xml:space="preserve"> </w:t>
+        <w:t>Still if needed: Beats tab, with Listen</w:t>
+      </w:r>
+      <w:r>
+        <w:rPr>
+          <w:rFonts w:ascii="Calibri" w:hAnsi="Calibri" w:eastAsia="Calibri"/>
+          <w:b w:val="0"/>
+          <w:sz w:val="22"/>
+        </w:rPr>
+        <w:t xml:space="preserve"/>
       </w:r>
       <w:r>
         <w:rPr>
@@ -2127,7 +2258,15 @@
           <w:color w:val="1E406E"/>
           <w:sz w:val="20"/>
         </w:rPr>
-        <w:t>Audience Resonance scores</w:t>
+        <w:t/>
+      </w:r>
+      <w:r>
+        <w:rPr>
+          <w:rFonts w:ascii="Calibri" w:hAnsi="Calibri" w:eastAsia="Calibri"/>
+          <w:b w:val="0"/>
+          <w:sz w:val="22"/>
+        </w:rPr>
+        <w:t/>
       </w:r>
     </w:p>
     <w:p>
@@ -2141,15 +2280,32 @@
           <w:b/>
           <w:sz w:val="22"/>
         </w:rPr>
-        <w:t>Narration:</w:t>
-      </w:r>
-      <w:r>
-        <w:rPr>
-          <w:rFonts w:ascii="Calibri" w:hAnsi="Calibri" w:eastAsia="Calibri"/>
-          <w:b w:val="0"/>
-          <w:sz w:val="22"/>
-        </w:rPr>
-        <w:t xml:space="preserve"> Score it against the audience you named. Concept. Tone. Her. The beats. You see what lands, and you decide what to revise. Picture spend waits.</w:t>
+        <w:t>Narration: Optimize the beats here. They drive the script. Beats exist only here. Leave them wrong, and Production has to rebuild the script.</w:t>
+      </w:r>
+      <w:r>
+        <w:rPr>
+          <w:rFonts w:ascii="Calibri" w:hAnsi="Calibri" w:eastAsia="Calibri"/>
+          <w:b w:val="0"/>
+          <w:sz w:val="22"/>
+        </w:rPr>
+        <w:t xml:space="preserve"/>
+      </w:r>
+      <w:r>
+        <w:rPr>
+          <w:rFonts w:ascii="Consolas" w:hAnsi="Consolas" w:eastAsia="Consolas"/>
+          <w:b w:val="0"/>
+          <w:color w:val="1E406E"/>
+          <w:sz w:val="20"/>
+        </w:rPr>
+        <w:t/>
+      </w:r>
+      <w:r>
+        <w:rPr>
+          <w:rFonts w:ascii="Calibri" w:hAnsi="Calibri" w:eastAsia="Calibri"/>
+          <w:b w:val="0"/>
+          <w:sz w:val="22"/>
+        </w:rPr>
+        <w:t/>
       </w:r>
     </w:p>
     <w:p>
@@ -2163,15 +2319,32 @@
           <w:b/>
           <w:sz w:val="22"/>
         </w:rPr>
-        <w:t>Words:</w:t>
-      </w:r>
-      <w:r>
-        <w:rPr>
-          <w:rFonts w:ascii="Calibri" w:hAnsi="Calibri" w:eastAsia="Calibri"/>
-          <w:b w:val="0"/>
-          <w:sz w:val="22"/>
-        </w:rPr>
-        <w:t xml:space="preserve"> 25</w:t>
+        <w:t>Words: 22</w:t>
+      </w:r>
+      <w:r>
+        <w:rPr>
+          <w:rFonts w:ascii="Calibri" w:hAnsi="Calibri" w:eastAsia="Calibri"/>
+          <w:b w:val="0"/>
+          <w:sz w:val="22"/>
+        </w:rPr>
+        <w:t xml:space="preserve"/>
+      </w:r>
+      <w:r>
+        <w:rPr>
+          <w:rFonts w:ascii="Consolas" w:hAnsi="Consolas" w:eastAsia="Consolas"/>
+          <w:b w:val="0"/>
+          <w:color w:val="1E406E"/>
+          <w:sz w:val="20"/>
+        </w:rPr>
+        <w:t/>
+      </w:r>
+      <w:r>
+        <w:rPr>
+          <w:rFonts w:ascii="Calibri" w:hAnsi="Calibri" w:eastAsia="Calibri"/>
+          <w:b w:val="0"/>
+          <w:sz w:val="22"/>
+        </w:rPr>
+        <w:t/>
       </w:r>
     </w:p>
     <w:p>
@@ -2183,7 +2356,7 @@
         <w:rPr>
           <w:color w:val="111827"/>
         </w:rPr>
-        <w:t>0:46–0:58 — The same gesture, on the board</w:t>
+        <w:t>0:32–0:48 — Direct the cast and the locations</w:t>
       </w:r>
     </w:p>
     <w:p>
@@ -2197,15 +2370,32 @@
           <w:b/>
           <w:sz w:val="22"/>
         </w:rPr>
-        <w:t>Picture:</w:t>
-      </w:r>
-      <w:r>
-        <w:rPr>
-          <w:rFonts w:ascii="Calibri" w:hAnsi="Calibri" w:eastAsia="Calibri"/>
-          <w:b w:val="0"/>
-          <w:sz w:val="22"/>
-        </w:rPr>
-        <w:t xml:space="preserve"> Capture. Co-Director. A short spoken or typed note. A preview of the rewrite. The art direction already on the treatment does not clear. She keeps one change and leaves the rest.</w:t>
+        <w:t>Picture: Capture. Characters, held on the cast. Cut to Setting on the Story tab. Cut on a match, not a scroll.</w:t>
+      </w:r>
+      <w:r>
+        <w:rPr>
+          <w:rFonts w:ascii="Calibri" w:hAnsi="Calibri" w:eastAsia="Calibri"/>
+          <w:b w:val="0"/>
+          <w:sz w:val="22"/>
+        </w:rPr>
+        <w:t xml:space="preserve"/>
+      </w:r>
+      <w:r>
+        <w:rPr>
+          <w:rFonts w:ascii="Consolas" w:hAnsi="Consolas" w:eastAsia="Consolas"/>
+          <w:b w:val="0"/>
+          <w:color w:val="1E406E"/>
+          <w:sz w:val="20"/>
+        </w:rPr>
+        <w:t/>
+      </w:r>
+      <w:r>
+        <w:rPr>
+          <w:rFonts w:ascii="Calibri" w:hAnsi="Calibri" w:eastAsia="Calibri"/>
+          <w:b w:val="0"/>
+          <w:sz w:val="22"/>
+        </w:rPr>
+        <w:t/>
       </w:r>
     </w:p>
     <w:p>
@@ -2219,15 +2409,15 @@
           <w:b/>
           <w:sz w:val="22"/>
         </w:rPr>
-        <w:t>Still if needed:</w:t>
-      </w:r>
-      <w:r>
-        <w:rPr>
-          <w:rFonts w:ascii="Calibri" w:hAnsi="Calibri" w:eastAsia="Calibri"/>
-          <w:b w:val="0"/>
-          <w:sz w:val="22"/>
-        </w:rPr>
-        <w:t xml:space="preserve"> </w:t>
+        <w:t>Still if needed: Characters tab, then Setting on Story</w:t>
+      </w:r>
+      <w:r>
+        <w:rPr>
+          <w:rFonts w:ascii="Calibri" w:hAnsi="Calibri" w:eastAsia="Calibri"/>
+          <w:b w:val="0"/>
+          <w:sz w:val="22"/>
+        </w:rPr>
+        <w:t xml:space="preserve"/>
       </w:r>
       <w:r>
         <w:rPr>
@@ -2236,7 +2426,15 @@
           <w:color w:val="1E406E"/>
           <w:sz w:val="20"/>
         </w:rPr>
-        <w:t>Co-Director · Blueprint</w:t>
+        <w:t/>
+      </w:r>
+      <w:r>
+        <w:rPr>
+          <w:rFonts w:ascii="Calibri" w:hAnsi="Calibri" w:eastAsia="Calibri"/>
+          <w:b w:val="0"/>
+          <w:sz w:val="22"/>
+        </w:rPr>
+        <w:t/>
       </w:r>
     </w:p>
     <w:p>
@@ -2250,15 +2448,32 @@
           <w:b/>
           <w:sz w:val="22"/>
         </w:rPr>
-        <w:t>Narration:</w:t>
-      </w:r>
-      <w:r>
-        <w:rPr>
-          <w:rFonts w:ascii="Calibri" w:hAnsi="Calibri" w:eastAsia="Calibri"/>
-          <w:b w:val="0"/>
-          <w:sz w:val="22"/>
-        </w:rPr>
-        <w:t xml:space="preserve"> Tell it what to change. In words, or out loud. Keep the lines you want. The look you already locked stays.</w:t>
+        <w:t>Narration: Optimize the cast. The cast shapes the script. Direct the locations with it. Production should not have to recast the story.</w:t>
+      </w:r>
+      <w:r>
+        <w:rPr>
+          <w:rFonts w:ascii="Calibri" w:hAnsi="Calibri" w:eastAsia="Calibri"/>
+          <w:b w:val="0"/>
+          <w:sz w:val="22"/>
+        </w:rPr>
+        <w:t xml:space="preserve"/>
+      </w:r>
+      <w:r>
+        <w:rPr>
+          <w:rFonts w:ascii="Consolas" w:hAnsi="Consolas" w:eastAsia="Consolas"/>
+          <w:b w:val="0"/>
+          <w:color w:val="1E406E"/>
+          <w:sz w:val="20"/>
+        </w:rPr>
+        <w:t/>
+      </w:r>
+      <w:r>
+        <w:rPr>
+          <w:rFonts w:ascii="Calibri" w:hAnsi="Calibri" w:eastAsia="Calibri"/>
+          <w:b w:val="0"/>
+          <w:sz w:val="22"/>
+        </w:rPr>
+        <w:t/>
       </w:r>
     </w:p>
     <w:p>
@@ -2272,15 +2487,32 @@
           <w:b/>
           <w:sz w:val="22"/>
         </w:rPr>
-        <w:t>Words:</w:t>
-      </w:r>
-      <w:r>
-        <w:rPr>
-          <w:rFonts w:ascii="Calibri" w:hAnsi="Calibri" w:eastAsia="Calibri"/>
-          <w:b w:val="0"/>
-          <w:sz w:val="22"/>
-        </w:rPr>
-        <w:t xml:space="preserve"> 21</w:t>
+        <w:t>Words: 21</w:t>
+      </w:r>
+      <w:r>
+        <w:rPr>
+          <w:rFonts w:ascii="Calibri" w:hAnsi="Calibri" w:eastAsia="Calibri"/>
+          <w:b w:val="0"/>
+          <w:sz w:val="22"/>
+        </w:rPr>
+        <w:t xml:space="preserve"/>
+      </w:r>
+      <w:r>
+        <w:rPr>
+          <w:rFonts w:ascii="Consolas" w:hAnsi="Consolas" w:eastAsia="Consolas"/>
+          <w:b w:val="0"/>
+          <w:color w:val="1E406E"/>
+          <w:sz w:val="20"/>
+        </w:rPr>
+        <w:t/>
+      </w:r>
+      <w:r>
+        <w:rPr>
+          <w:rFonts w:ascii="Calibri" w:hAnsi="Calibri" w:eastAsia="Calibri"/>
+          <w:b w:val="0"/>
+          <w:sz w:val="22"/>
+        </w:rPr>
+        <w:t/>
       </w:r>
     </w:p>
     <w:p>
@@ -2292,7 +2524,7 @@
         <w:rPr>
           <w:color w:val="111827"/>
         </w:rPr>
-        <w:t>0:58–1:10 — They hear the same board</w:t>
+        <w:t>0:48–1:00 — Blueprint Director</w:t>
       </w:r>
     </w:p>
     <w:p>
@@ -2306,15 +2538,32 @@
           <w:b/>
           <w:sz w:val="22"/>
         </w:rPr>
-        <w:t>Picture:</w:t>
-      </w:r>
-      <w:r>
-        <w:rPr>
-          <w:rFonts w:ascii="Calibri" w:hAnsi="Calibri" w:eastAsia="Calibri"/>
-          <w:b w:val="0"/>
-          <w:sz w:val="22"/>
-        </w:rPr>
-        <w:t xml:space="preserve"> Capture, then a phone. The treatment share. Narration plays. The collaborator sees the same board. A note returns on that board. The phone lights with the note. The studio stays on the desktop.</w:t>
+        <w:t>Picture: Capture. Blueprint Director. Spoken or typed direction. Focus on Beats, Characters, or Story. She previews the revision and applies it. The button and the dialog say Blueprint Director.</w:t>
+      </w:r>
+      <w:r>
+        <w:rPr>
+          <w:rFonts w:ascii="Calibri" w:hAnsi="Calibri" w:eastAsia="Calibri"/>
+          <w:b w:val="0"/>
+          <w:sz w:val="22"/>
+        </w:rPr>
+        <w:t xml:space="preserve"/>
+      </w:r>
+      <w:r>
+        <w:rPr>
+          <w:rFonts w:ascii="Consolas" w:hAnsi="Consolas" w:eastAsia="Consolas"/>
+          <w:b w:val="0"/>
+          <w:color w:val="1E406E"/>
+          <w:sz w:val="20"/>
+        </w:rPr>
+        <w:t/>
+      </w:r>
+      <w:r>
+        <w:rPr>
+          <w:rFonts w:ascii="Calibri" w:hAnsi="Calibri" w:eastAsia="Calibri"/>
+          <w:b w:val="0"/>
+          <w:sz w:val="22"/>
+        </w:rPr>
+        <w:t/>
       </w:r>
     </w:p>
     <w:p>
@@ -2328,15 +2577,15 @@
           <w:b/>
           <w:sz w:val="22"/>
         </w:rPr>
-        <w:t>Still if needed:</w:t>
-      </w:r>
-      <w:r>
-        <w:rPr>
-          <w:rFonts w:ascii="Calibri" w:hAnsi="Calibri" w:eastAsia="Calibri"/>
-          <w:b w:val="0"/>
-          <w:sz w:val="22"/>
-        </w:rPr>
-        <w:t xml:space="preserve"> </w:t>
+        <w:t>Still if needed: Blueprint Director — direction, focus, preview, Apply revision</w:t>
+      </w:r>
+      <w:r>
+        <w:rPr>
+          <w:rFonts w:ascii="Calibri" w:hAnsi="Calibri" w:eastAsia="Calibri"/>
+          <w:b w:val="0"/>
+          <w:sz w:val="22"/>
+        </w:rPr>
+        <w:t xml:space="preserve"/>
       </w:r>
       <w:r>
         <w:rPr>
@@ -2345,7 +2594,15 @@
           <w:color w:val="1E406E"/>
           <w:sz w:val="20"/>
         </w:rPr>
-        <w:t>Share link</w:t>
+        <w:t/>
+      </w:r>
+      <w:r>
+        <w:rPr>
+          <w:rFonts w:ascii="Calibri" w:hAnsi="Calibri" w:eastAsia="Calibri"/>
+          <w:b w:val="0"/>
+          <w:sz w:val="22"/>
+        </w:rPr>
+        <w:t/>
       </w:r>
     </w:p>
     <w:p>
@@ -2359,15 +2616,32 @@
           <w:b/>
           <w:sz w:val="22"/>
         </w:rPr>
-        <w:t>Narration:</w:t>
-      </w:r>
-      <w:r>
-        <w:rPr>
-          <w:rFonts w:ascii="Calibri" w:hAnsi="Calibri" w:eastAsia="Calibri"/>
-          <w:b w:val="0"/>
-          <w:sz w:val="22"/>
-        </w:rPr>
-        <w:t xml:space="preserve"> Send the board. They read it, and they hear it. Notes come back on the work, not as a file in some other place. You can read a new one on your phone.</w:t>
+        <w:t>Narration: Direct it in Blueprint Director. Focus on the beats, the cast, or the story. Preview the change. Then apply it.</w:t>
+      </w:r>
+      <w:r>
+        <w:rPr>
+          <w:rFonts w:ascii="Calibri" w:hAnsi="Calibri" w:eastAsia="Calibri"/>
+          <w:b w:val="0"/>
+          <w:sz w:val="22"/>
+        </w:rPr>
+        <w:t xml:space="preserve"/>
+      </w:r>
+      <w:r>
+        <w:rPr>
+          <w:rFonts w:ascii="Consolas" w:hAnsi="Consolas" w:eastAsia="Consolas"/>
+          <w:b w:val="0"/>
+          <w:color w:val="1E406E"/>
+          <w:sz w:val="20"/>
+        </w:rPr>
+        <w:t/>
+      </w:r>
+      <w:r>
+        <w:rPr>
+          <w:rFonts w:ascii="Calibri" w:hAnsi="Calibri" w:eastAsia="Calibri"/>
+          <w:b w:val="0"/>
+          <w:sz w:val="22"/>
+        </w:rPr>
+        <w:t/>
       </w:r>
     </w:p>
     <w:p>
@@ -2381,15 +2655,32 @@
           <w:b/>
           <w:sz w:val="22"/>
         </w:rPr>
-        <w:t>Words:</w:t>
-      </w:r>
-      <w:r>
-        <w:rPr>
-          <w:rFonts w:ascii="Calibri" w:hAnsi="Calibri" w:eastAsia="Calibri"/>
-          <w:b w:val="0"/>
-          <w:sz w:val="22"/>
-        </w:rPr>
-        <w:t xml:space="preserve"> 33</w:t>
+        <w:t>Words: 20</w:t>
+      </w:r>
+      <w:r>
+        <w:rPr>
+          <w:rFonts w:ascii="Calibri" w:hAnsi="Calibri" w:eastAsia="Calibri"/>
+          <w:b w:val="0"/>
+          <w:sz w:val="22"/>
+        </w:rPr>
+        <w:t xml:space="preserve"/>
+      </w:r>
+      <w:r>
+        <w:rPr>
+          <w:rFonts w:ascii="Consolas" w:hAnsi="Consolas" w:eastAsia="Consolas"/>
+          <w:b w:val="0"/>
+          <w:color w:val="1E406E"/>
+          <w:sz w:val="20"/>
+        </w:rPr>
+        <w:t/>
+      </w:r>
+      <w:r>
+        <w:rPr>
+          <w:rFonts w:ascii="Calibri" w:hAnsi="Calibri" w:eastAsia="Calibri"/>
+          <w:b w:val="0"/>
+          <w:sz w:val="22"/>
+        </w:rPr>
+        <w:t/>
       </w:r>
     </w:p>
     <w:p>
@@ -2401,7 +2692,7 @@
         <w:rPr>
           <w:color w:val="111827"/>
         </w:rPr>
-        <w:t>1:10–1:15 — Handoff</w:t>
+        <w:t>1:00–1:08 — Audience Resonance</w:t>
       </w:r>
     </w:p>
     <w:p>
@@ -2415,15 +2706,32 @@
           <w:b/>
           <w:sz w:val="22"/>
         </w:rPr>
-        <w:t>Picture:</w:t>
-      </w:r>
-      <w:r>
-        <w:rPr>
-          <w:rFonts w:ascii="Calibri" w:hAnsi="Calibri" w:eastAsia="Calibri"/>
-          <w:b w:val="0"/>
-          <w:sz w:val="22"/>
-        </w:rPr>
-        <w:t xml:space="preserve"> Still of the beat sheet, then a one-second dip to black. No card.</w:t>
+        <w:t>Picture: Capture. Audience Resonance. The audience is saved. Hold the scores and the recommendations. She does not apply one.</w:t>
+      </w:r>
+      <w:r>
+        <w:rPr>
+          <w:rFonts w:ascii="Calibri" w:hAnsi="Calibri" w:eastAsia="Calibri"/>
+          <w:b w:val="0"/>
+          <w:sz w:val="22"/>
+        </w:rPr>
+        <w:t xml:space="preserve"/>
+      </w:r>
+      <w:r>
+        <w:rPr>
+          <w:rFonts w:ascii="Consolas" w:hAnsi="Consolas" w:eastAsia="Consolas"/>
+          <w:b w:val="0"/>
+          <w:color w:val="1E406E"/>
+          <w:sz w:val="20"/>
+        </w:rPr>
+        <w:t/>
+      </w:r>
+      <w:r>
+        <w:rPr>
+          <w:rFonts w:ascii="Calibri" w:hAnsi="Calibri" w:eastAsia="Calibri"/>
+          <w:b w:val="0"/>
+          <w:sz w:val="22"/>
+        </w:rPr>
+        <w:t/>
       </w:r>
     </w:p>
     <w:p>
@@ -2437,15 +2745,32 @@
           <w:b/>
           <w:sz w:val="22"/>
         </w:rPr>
-        <w:t>Narration:</w:t>
-      </w:r>
-      <w:r>
-        <w:rPr>
-          <w:rFonts w:ascii="Calibri" w:hAnsi="Calibri" w:eastAsia="Calibri"/>
-          <w:b w:val="0"/>
-          <w:sz w:val="22"/>
-        </w:rPr>
-        <w:t xml:space="preserve"> The beats are set. Picture starts after this.</w:t>
+        <w:t>Still if needed: Audience Resonance — saved audience, scores, recommendations unapplied</w:t>
+      </w:r>
+      <w:r>
+        <w:rPr>
+          <w:rFonts w:ascii="Calibri" w:hAnsi="Calibri" w:eastAsia="Calibri"/>
+          <w:b w:val="0"/>
+          <w:sz w:val="22"/>
+        </w:rPr>
+        <w:t xml:space="preserve"/>
+      </w:r>
+      <w:r>
+        <w:rPr>
+          <w:rFonts w:ascii="Consolas" w:hAnsi="Consolas" w:eastAsia="Consolas"/>
+          <w:b w:val="0"/>
+          <w:color w:val="1E406E"/>
+          <w:sz w:val="20"/>
+        </w:rPr>
+        <w:t/>
+      </w:r>
+      <w:r>
+        <w:rPr>
+          <w:rFonts w:ascii="Calibri" w:hAnsi="Calibri" w:eastAsia="Calibri"/>
+          <w:b w:val="0"/>
+          <w:sz w:val="22"/>
+        </w:rPr>
+        <w:t/>
       </w:r>
     </w:p>
     <w:p>
@@ -2459,20 +2784,38 @@
           <w:b/>
           <w:sz w:val="22"/>
         </w:rPr>
-        <w:t>Words:</w:t>
-      </w:r>
-      <w:r>
-        <w:rPr>
-          <w:rFonts w:ascii="Calibri" w:hAnsi="Calibri" w:eastAsia="Calibri"/>
-          <w:b w:val="0"/>
-          <w:sz w:val="22"/>
-        </w:rPr>
-        <w:t xml:space="preserve"> 8</w:t>
+        <w:t>Narration: Run Audience Resonance when you want a read. See what lands. Apply it only if you choose to.</w:t>
+      </w:r>
+      <w:r>
+        <w:rPr>
+          <w:rFonts w:ascii="Calibri" w:hAnsi="Calibri" w:eastAsia="Calibri"/>
+          <w:b w:val="0"/>
+          <w:sz w:val="22"/>
+        </w:rPr>
+        <w:t xml:space="preserve"/>
+      </w:r>
+      <w:r>
+        <w:rPr>
+          <w:rFonts w:ascii="Consolas" w:hAnsi="Consolas" w:eastAsia="Consolas"/>
+          <w:b w:val="0"/>
+          <w:color w:val="1E406E"/>
+          <w:sz w:val="20"/>
+        </w:rPr>
+        <w:t/>
+      </w:r>
+      <w:r>
+        <w:rPr>
+          <w:rFonts w:ascii="Calibri" w:hAnsi="Calibri" w:eastAsia="Calibri"/>
+          <w:b w:val="0"/>
+          <w:sz w:val="22"/>
+        </w:rPr>
+        <w:t/>
       </w:r>
     </w:p>
     <w:p>
       <w:pPr>
-        <w:spacing w:before="0" w:after="160" w:line="259" w:lineRule="auto"/>
+        <w:pStyle w:val="ListBullet"/>
+        <w:spacing w:before="0" w:after="60" w:line="259" w:lineRule="auto"/>
       </w:pPr>
       <w:r>
         <w:rPr>
@@ -2480,19 +2823,225 @@
           <w:b/>
           <w:sz w:val="22"/>
         </w:rPr>
-        <w:t>Spoken total:</w:t>
-      </w:r>
-      <w:r>
-        <w:rPr>
-          <w:rFonts w:ascii="Calibri" w:hAnsi="Calibri" w:eastAsia="Calibri"/>
-          <w:b w:val="0"/>
-          <w:sz w:val="22"/>
-        </w:rPr>
-        <w:t xml:space="preserve"> 129 words.</w:t>
+        <w:t>Words: 18</w:t>
+      </w:r>
+      <w:r>
+        <w:rPr>
+          <w:rFonts w:ascii="Calibri" w:hAnsi="Calibri" w:eastAsia="Calibri"/>
+          <w:b w:val="0"/>
+          <w:sz w:val="22"/>
+        </w:rPr>
+        <w:t xml:space="preserve"/>
+      </w:r>
+      <w:r>
+        <w:rPr>
+          <w:rFonts w:ascii="Consolas" w:hAnsi="Consolas" w:eastAsia="Consolas"/>
+          <w:b w:val="0"/>
+          <w:color w:val="1E406E"/>
+          <w:sz w:val="20"/>
+        </w:rPr>
+        <w:t/>
+      </w:r>
+      <w:r>
+        <w:rPr>
+          <w:rFonts w:ascii="Calibri" w:hAnsi="Calibri" w:eastAsia="Calibri"/>
+          <w:b w:val="0"/>
+          <w:sz w:val="22"/>
+        </w:rPr>
+        <w:t/>
       </w:r>
     </w:p>
     <w:p>
       <w:pPr>
+        <w:pStyle w:val="Heading3"/>
+        <w:spacing w:before="240" w:after="120"/>
+      </w:pPr>
+      <w:r>
+        <w:rPr>
+          <w:color w:val="111827"/>
+        </w:rPr>
+        <w:t>1:08–1:15 — Go to Production Stage</w:t>
+      </w:r>
+    </w:p>
+    <w:p>
+      <w:pPr>
+        <w:pStyle w:val="ListBullet"/>
+        <w:spacing w:before="0" w:after="60" w:line="259" w:lineRule="auto"/>
+      </w:pPr>
+      <w:r>
+        <w:rPr>
+          <w:rFonts w:ascii="Calibri" w:hAnsi="Calibri" w:eastAsia="Calibri"/>
+          <w:b/>
+          <w:sz w:val="22"/>
+        </w:rPr>
+        <w:t>Picture: Capture. Go to Production Stage. Then a one-second dip to black. No card. Share stays in the room and is not a beat in this cut.</w:t>
+      </w:r>
+      <w:r>
+        <w:rPr>
+          <w:rFonts w:ascii="Calibri" w:hAnsi="Calibri" w:eastAsia="Calibri"/>
+          <w:b w:val="0"/>
+          <w:sz w:val="22"/>
+        </w:rPr>
+        <w:t xml:space="preserve"/>
+      </w:r>
+      <w:r>
+        <w:rPr>
+          <w:rFonts w:ascii="Consolas" w:hAnsi="Consolas" w:eastAsia="Consolas"/>
+          <w:b w:val="0"/>
+          <w:color w:val="1E406E"/>
+          <w:sz w:val="20"/>
+        </w:rPr>
+        <w:t/>
+      </w:r>
+      <w:r>
+        <w:rPr>
+          <w:rFonts w:ascii="Calibri" w:hAnsi="Calibri" w:eastAsia="Calibri"/>
+          <w:b w:val="0"/>
+          <w:sz w:val="22"/>
+        </w:rPr>
+        <w:t/>
+      </w:r>
+    </w:p>
+    <w:p>
+      <w:pPr>
+        <w:pStyle w:val="ListBullet"/>
+        <w:spacing w:before="0" w:after="60" w:line="259" w:lineRule="auto"/>
+      </w:pPr>
+      <w:r>
+        <w:rPr>
+          <w:rFonts w:ascii="Calibri" w:hAnsi="Calibri" w:eastAsia="Calibri"/>
+          <w:b/>
+          <w:sz w:val="22"/>
+        </w:rPr>
+        <w:t>Still if needed: Go to Production Stage — storyline, beats, and cast already set</w:t>
+      </w:r>
+      <w:r>
+        <w:rPr>
+          <w:rFonts w:ascii="Calibri" w:hAnsi="Calibri" w:eastAsia="Calibri"/>
+          <w:b w:val="0"/>
+          <w:sz w:val="22"/>
+        </w:rPr>
+        <w:t xml:space="preserve"/>
+      </w:r>
+      <w:r>
+        <w:rPr>
+          <w:rFonts w:ascii="Consolas" w:hAnsi="Consolas" w:eastAsia="Consolas"/>
+          <w:b w:val="0"/>
+          <w:color w:val="1E406E"/>
+          <w:sz w:val="20"/>
+        </w:rPr>
+        <w:t/>
+      </w:r>
+      <w:r>
+        <w:rPr>
+          <w:rFonts w:ascii="Calibri" w:hAnsi="Calibri" w:eastAsia="Calibri"/>
+          <w:b w:val="0"/>
+          <w:sz w:val="22"/>
+        </w:rPr>
+        <w:t/>
+      </w:r>
+    </w:p>
+    <w:p>
+      <w:pPr>
+        <w:pStyle w:val="ListBullet"/>
+        <w:spacing w:before="0" w:after="60" w:line="259" w:lineRule="auto"/>
+      </w:pPr>
+      <w:r>
+        <w:rPr>
+          <w:rFonts w:ascii="Calibri" w:hAnsi="Calibri" w:eastAsia="Calibri"/>
+          <w:b/>
+          <w:sz w:val="22"/>
+        </w:rPr>
+        <w:t>Narration: The storyline is set. The script is built from this.</w:t>
+      </w:r>
+      <w:r>
+        <w:rPr>
+          <w:rFonts w:ascii="Calibri" w:hAnsi="Calibri" w:eastAsia="Calibri"/>
+          <w:b w:val="0"/>
+          <w:sz w:val="22"/>
+        </w:rPr>
+        <w:t xml:space="preserve"/>
+      </w:r>
+      <w:r>
+        <w:rPr>
+          <w:rFonts w:ascii="Consolas" w:hAnsi="Consolas" w:eastAsia="Consolas"/>
+          <w:b w:val="0"/>
+          <w:color w:val="1E406E"/>
+          <w:sz w:val="20"/>
+        </w:rPr>
+        <w:t/>
+      </w:r>
+      <w:r>
+        <w:rPr>
+          <w:rFonts w:ascii="Calibri" w:hAnsi="Calibri" w:eastAsia="Calibri"/>
+          <w:b w:val="0"/>
+          <w:sz w:val="22"/>
+        </w:rPr>
+        <w:t/>
+      </w:r>
+    </w:p>
+    <w:p>
+      <w:pPr>
+        <w:pStyle w:val="ListBullet"/>
+        <w:spacing w:before="0" w:after="60" w:line="259" w:lineRule="auto"/>
+      </w:pPr>
+      <w:r>
+        <w:rPr>
+          <w:rFonts w:ascii="Calibri" w:hAnsi="Calibri" w:eastAsia="Calibri"/>
+          <w:b/>
+          <w:sz w:val="22"/>
+        </w:rPr>
+        <w:t>Words: 10</w:t>
+      </w:r>
+      <w:r>
+        <w:rPr>
+          <w:rFonts w:ascii="Calibri" w:hAnsi="Calibri" w:eastAsia="Calibri"/>
+          <w:b w:val="0"/>
+          <w:sz w:val="22"/>
+        </w:rPr>
+        <w:t xml:space="preserve"/>
+      </w:r>
+      <w:r>
+        <w:rPr>
+          <w:rFonts w:ascii="Consolas" w:hAnsi="Consolas" w:eastAsia="Consolas"/>
+          <w:b w:val="0"/>
+          <w:color w:val="1E406E"/>
+          <w:sz w:val="20"/>
+        </w:rPr>
+        <w:t/>
+      </w:r>
+      <w:r>
+        <w:rPr>
+          <w:rFonts w:ascii="Calibri" w:hAnsi="Calibri" w:eastAsia="Calibri"/>
+          <w:b w:val="0"/>
+          <w:sz w:val="22"/>
+        </w:rPr>
+        <w:t/>
+      </w:r>
+    </w:p>
+    <w:p>
+      <w:pPr>
+        <w:spacing w:before="0" w:after="160" w:line="259" w:lineRule="auto"/>
+      </w:pPr>
+      <w:r>
+        <w:rPr>
+          <w:rFonts w:ascii="Calibri" w:hAnsi="Calibri" w:eastAsia="Calibri"/>
+          <w:b/>
+          <w:sz w:val="22"/>
+        </w:rPr>
+        <w:t>Spoken total: 133 words.</w:t>
+      </w:r>
+      <w:r>
+        <w:rPr>
+          <w:rFonts w:ascii="Calibri" w:hAnsi="Calibri" w:eastAsia="Calibri"/>
+          <w:b w:val="0"/>
+          <w:sz w:val="22"/>
+        </w:rPr>
+        <w:t xml:space="preserve"/>
+      </w:r>
+    </w:p>
+    <w:p>
+      <w:pPr>
         <w:pStyle w:val="Heading2"/>
         <w:spacing w:before="320" w:after="120"/>
       </w:pPr>
@@ -4813,6 +5362,40 @@
     </w:p>
     <w:p>
       <w:pPr>
+        <w:spacing w:before="0" w:after="160" w:line="259" w:lineRule="auto"/>
+      </w:pPr>
+      <w:r>
+        <w:rPr>
+          <w:rFonts w:ascii="Calibri" w:hAnsi="Calibri" w:eastAsia="Calibri"/>
+          <w:b w:val="0"/>
+          <w:sz w:val="22"/>
+        </w:rPr>
+        <w:t>The Series Director demo also covers Direct this episode. Blueprint Director has its own demo. Go to Production Stage is spoken in the Blueprint room film, at 1:08. Share the treatment has no separate 30-second file. Start the episode is spoken in the Series Room film, at 1:18. It has no separate 30-second file.</w:t>
+      </w:r>
+    </w:p>
+    <w:p>
+      <w:pPr>
+        <w:spacing w:before="0" w:after="160" w:line="259" w:lineRule="auto"/>
+      </w:pPr>
+      <w:r>
+        <w:rPr>
+          <w:rFonts w:ascii="Calibri" w:hAnsi="Calibri" w:eastAsia="Calibri"/>
+          <w:b/>
+          <w:sz w:val="22"/>
+        </w:rPr>
+        <w:t>These Blueprint demos are narrated by Ana. Open on her, not on the drama Omni clips. The close is a held still of the capture. Do not cut in the wool-coat woman.</w:t>
+      </w:r>
+      <w:r>
+        <w:rPr>
+          <w:rFonts w:ascii="Calibri" w:hAnsi="Calibri" w:eastAsia="Calibri"/>
+          <w:b w:val="0"/>
+          <w:sz w:val="22"/>
+        </w:rPr>
+        <w:t xml:space="preserve"/>
+      </w:r>
+    </w:p>
+    <w:p>
+      <w:pPr>
         <w:pStyle w:val="Heading3"/>
         <w:spacing w:before="240" w:after="120"/>
       </w:pPr>
@@ -4820,7 +5403,7 @@
         <w:rPr>
           <w:color w:val="111827"/>
         </w:rPr>
-        <w:t>Treatment and beat sheet — `treatment` — 30s</w:t>
+        <w:t>Start the Blueprint — `startBlueprint` — 30s</w:t>
       </w:r>
     </w:p>
     <w:p>
@@ -4834,47 +5417,32 @@
           <w:b/>
           <w:sz w:val="22"/>
         </w:rPr>
-        <w:t>0:00–0:03 Picture:</w:t>
-      </w:r>
-      <w:r>
-        <w:rPr>
-          <w:rFonts w:ascii="Calibri" w:hAnsi="Calibri" w:eastAsia="Calibri"/>
-          <w:b w:val="0"/>
-          <w:sz w:val="22"/>
-        </w:rPr>
-        <w:t xml:space="preserve"> Still of a single sentence on a dark card, then it is gone. </w:t>
-      </w:r>
-      <w:r>
-        <w:rPr>
-          <w:rFonts w:ascii="Calibri" w:hAnsi="Calibri" w:eastAsia="Calibri"/>
-          <w:b/>
-          <w:sz w:val="22"/>
-        </w:rPr>
-        <w:t>Narration:</w:t>
-      </w:r>
-      <w:r>
-        <w:rPr>
-          <w:rFonts w:ascii="Calibri" w:hAnsi="Calibri" w:eastAsia="Calibri"/>
-          <w:b w:val="0"/>
-          <w:sz w:val="22"/>
-        </w:rPr>
-        <w:t xml:space="preserve"> One sentence. </w:t>
-      </w:r>
-      <w:r>
-        <w:rPr>
-          <w:rFonts w:ascii="Calibri" w:hAnsi="Calibri" w:eastAsia="Calibri"/>
-          <w:b/>
-          <w:sz w:val="22"/>
-        </w:rPr>
-        <w:t>Words:</w:t>
-      </w:r>
-      <w:r>
-        <w:rPr>
-          <w:rFonts w:ascii="Calibri" w:hAnsi="Calibri" w:eastAsia="Calibri"/>
-          <w:b w:val="0"/>
-          <w:sz w:val="22"/>
-        </w:rPr>
-        <w:t xml:space="preserve"> 2</w:t>
+        <w:t>0:00–0:03 Picture: Ana at the studio desk, amber light, she turns toward the work. Narration: Start from the story you mean. Words: 6</w:t>
+      </w:r>
+      <w:r>
+        <w:rPr>
+          <w:rFonts w:ascii="Calibri" w:hAnsi="Calibri" w:eastAsia="Calibri"/>
+          <w:b w:val="0"/>
+          <w:sz w:val="22"/>
+        </w:rPr>
+        <w:t xml:space="preserve"/>
+      </w:r>
+      <w:r>
+        <w:rPr>
+          <w:rFonts w:ascii="Consolas" w:hAnsi="Consolas" w:eastAsia="Consolas"/>
+          <w:b w:val="0"/>
+          <w:color w:val="1E406E"/>
+          <w:sz w:val="20"/>
+        </w:rPr>
+        <w:t/>
+      </w:r>
+      <w:r>
+        <w:rPr>
+          <w:rFonts w:ascii="Calibri" w:hAnsi="Calibri" w:eastAsia="Calibri"/>
+          <w:b w:val="0"/>
+          <w:sz w:val="22"/>
+        </w:rPr>
+        <w:t/>
       </w:r>
     </w:p>
     <w:p>
@@ -4888,31 +5456,15 @@
           <w:b/>
           <w:sz w:val="22"/>
         </w:rPr>
-        <w:t>0:03–0:23 Picture:</w:t>
-      </w:r>
-      <w:r>
-        <w:rPr>
-          <w:rFonts w:ascii="Calibri" w:hAnsi="Calibri" w:eastAsia="Calibri"/>
-          <w:b w:val="0"/>
-          <w:sz w:val="22"/>
-        </w:rPr>
-        <w:t xml:space="preserve"> Capture. That sentence becomes motivations, characters, art direction, and the only beat sheet. Hold on the beats. </w:t>
-      </w:r>
-      <w:r>
-        <w:rPr>
-          <w:rFonts w:ascii="Calibri" w:hAnsi="Calibri" w:eastAsia="Calibri"/>
-          <w:b/>
-          <w:sz w:val="22"/>
-        </w:rPr>
-        <w:t>Still:</w:t>
-      </w:r>
-      <w:r>
-        <w:rPr>
-          <w:rFonts w:ascii="Calibri" w:hAnsi="Calibri" w:eastAsia="Calibri"/>
-          <w:b w:val="0"/>
-          <w:sz w:val="22"/>
-        </w:rPr>
-        <w:t xml:space="preserve"> </w:t>
+        <w:t>0:03–0:23 Picture: Capture. A series episode already known, then Start Your Project. Intent, Validate &amp; Enhance with AI, Generate Blueprint. Still: Series episode already known, or Start Your Project — intent, Validate &amp; Enhance with AI, Generate Blueprint. Narration: A series episode arrives known. Or describe a new project, clarify it, and generate the blueprint. Words: 16</w:t>
+      </w:r>
+      <w:r>
+        <w:rPr>
+          <w:rFonts w:ascii="Calibri" w:hAnsi="Calibri" w:eastAsia="Calibri"/>
+          <w:b w:val="0"/>
+          <w:sz w:val="22"/>
+        </w:rPr>
+        <w:t xml:space="preserve"/>
       </w:r>
       <w:r>
         <w:rPr>
@@ -4921,47 +5473,15 @@
           <w:color w:val="1E406E"/>
           <w:sz w:val="20"/>
         </w:rPr>
-        <w:t>Treatment board</w:t>
-      </w:r>
-      <w:r>
-        <w:rPr>
-          <w:rFonts w:ascii="Calibri" w:hAnsi="Calibri" w:eastAsia="Calibri"/>
-          <w:b w:val="0"/>
-          <w:sz w:val="22"/>
-        </w:rPr>
-        <w:t xml:space="preserve">. </w:t>
-      </w:r>
-      <w:r>
-        <w:rPr>
-          <w:rFonts w:ascii="Calibri" w:hAnsi="Calibri" w:eastAsia="Calibri"/>
-          <w:b/>
-          <w:sz w:val="22"/>
-        </w:rPr>
-        <w:t>Narration:</w:t>
-      </w:r>
-      <w:r>
-        <w:rPr>
-          <w:rFonts w:ascii="Calibri" w:hAnsi="Calibri" w:eastAsia="Calibri"/>
-          <w:b w:val="0"/>
-          <w:sz w:val="22"/>
-        </w:rPr>
-        <w:t xml:space="preserve"> It becomes the treatment. Who she is, how the rooms look, and one beat sheet. Beats exist only here. Each one will become a chapter. Not a second list. </w:t>
-      </w:r>
-      <w:r>
-        <w:rPr>
-          <w:rFonts w:ascii="Calibri" w:hAnsi="Calibri" w:eastAsia="Calibri"/>
-          <w:b/>
-          <w:sz w:val="22"/>
-        </w:rPr>
-        <w:t>Words:</w:t>
-      </w:r>
-      <w:r>
-        <w:rPr>
-          <w:rFonts w:ascii="Calibri" w:hAnsi="Calibri" w:eastAsia="Calibri"/>
-          <w:b w:val="0"/>
-          <w:sz w:val="22"/>
-        </w:rPr>
-        <w:t xml:space="preserve"> 29</w:t>
+        <w:t/>
+      </w:r>
+      <w:r>
+        <w:rPr>
+          <w:rFonts w:ascii="Calibri" w:hAnsi="Calibri" w:eastAsia="Calibri"/>
+          <w:b w:val="0"/>
+          <w:sz w:val="22"/>
+        </w:rPr>
+        <w:t/>
       </w:r>
     </w:p>
     <w:p>
@@ -4975,15 +5495,15 @@
           <w:b/>
           <w:sz w:val="22"/>
         </w:rPr>
-        <w:t>0:23–0:30 Picture:</w:t>
-      </w:r>
-      <w:r>
-        <w:rPr>
-          <w:rFonts w:ascii="Calibri" w:hAnsi="Calibri" w:eastAsia="Calibri"/>
-          <w:b w:val="0"/>
-          <w:sz w:val="22"/>
-        </w:rPr>
-        <w:t xml:space="preserve"> Omni </w:t>
+        <w:t>0:23–0:30 Picture: The treatment, held. Narration: The treatment starts from that. Words: 5</w:t>
+      </w:r>
+      <w:r>
+        <w:rPr>
+          <w:rFonts w:ascii="Calibri" w:hAnsi="Calibri" w:eastAsia="Calibri"/>
+          <w:b w:val="0"/>
+          <w:sz w:val="22"/>
+        </w:rPr>
+        <w:t xml:space="preserve"/>
       </w:r>
       <w:r>
         <w:rPr>
@@ -4992,47 +5512,15 @@
           <w:color w:val="1E406E"/>
           <w:sz w:val="20"/>
         </w:rPr>
-        <w:t>omni-hold</w:t>
-      </w:r>
-      <w:r>
-        <w:rPr>
-          <w:rFonts w:ascii="Calibri" w:hAnsi="Calibri" w:eastAsia="Calibri"/>
-          <w:b w:val="0"/>
-          <w:sz w:val="22"/>
-        </w:rPr>
-        <w:t xml:space="preserve">, silent. </w:t>
-      </w:r>
-      <w:r>
-        <w:rPr>
-          <w:rFonts w:ascii="Calibri" w:hAnsi="Calibri" w:eastAsia="Calibri"/>
-          <w:b/>
-          <w:sz w:val="22"/>
-        </w:rPr>
-        <w:t>Narration:</w:t>
-      </w:r>
-      <w:r>
-        <w:rPr>
-          <w:rFonts w:ascii="Calibri" w:hAnsi="Calibri" w:eastAsia="Calibri"/>
-          <w:b w:val="0"/>
-          <w:sz w:val="22"/>
-        </w:rPr>
-        <w:t xml:space="preserve"> The film is decided before the picture. </w:t>
-      </w:r>
-      <w:r>
-        <w:rPr>
-          <w:rFonts w:ascii="Calibri" w:hAnsi="Calibri" w:eastAsia="Calibri"/>
-          <w:b/>
-          <w:sz w:val="22"/>
-        </w:rPr>
-        <w:t>Words:</w:t>
-      </w:r>
-      <w:r>
-        <w:rPr>
-          <w:rFonts w:ascii="Calibri" w:hAnsi="Calibri" w:eastAsia="Calibri"/>
-          <w:b w:val="0"/>
-          <w:sz w:val="22"/>
-        </w:rPr>
-        <w:t xml:space="preserve"> 7</w:t>
+        <w:t/>
+      </w:r>
+      <w:r>
+        <w:rPr>
+          <w:rFonts w:ascii="Calibri" w:hAnsi="Calibri" w:eastAsia="Calibri"/>
+          <w:b w:val="0"/>
+          <w:sz w:val="22"/>
+        </w:rPr>
+        <w:t/>
       </w:r>
     </w:p>
     <w:p>
@@ -5046,31 +5534,32 @@
           <w:b/>
           <w:sz w:val="22"/>
         </w:rPr>
-        <w:t>Bed:</w:t>
-      </w:r>
-      <w:r>
-        <w:rPr>
-          <w:rFonts w:ascii="Calibri" w:hAnsi="Calibri" w:eastAsia="Calibri"/>
-          <w:b w:val="0"/>
-          <w:sz w:val="22"/>
-        </w:rPr>
-        <w:t xml:space="preserve"> Blueprint. </w:t>
-      </w:r>
-      <w:r>
-        <w:rPr>
-          <w:rFonts w:ascii="Calibri" w:hAnsi="Calibri" w:eastAsia="Calibri"/>
-          <w:b/>
-          <w:sz w:val="22"/>
-        </w:rPr>
-        <w:t>Spoken:</w:t>
-      </w:r>
-      <w:r>
-        <w:rPr>
-          <w:rFonts w:ascii="Calibri" w:hAnsi="Calibri" w:eastAsia="Calibri"/>
-          <w:b w:val="0"/>
-          <w:sz w:val="22"/>
-        </w:rPr>
-        <w:t xml:space="preserve"> 38</w:t>
+        <w:t>Bed: Blueprint. Spoken: 27</w:t>
+      </w:r>
+      <w:r>
+        <w:rPr>
+          <w:rFonts w:ascii="Calibri" w:hAnsi="Calibri" w:eastAsia="Calibri"/>
+          <w:b w:val="0"/>
+          <w:sz w:val="22"/>
+        </w:rPr>
+        <w:t xml:space="preserve"/>
+      </w:r>
+      <w:r>
+        <w:rPr>
+          <w:rFonts w:ascii="Consolas" w:hAnsi="Consolas" w:eastAsia="Consolas"/>
+          <w:b w:val="0"/>
+          <w:color w:val="1E406E"/>
+          <w:sz w:val="20"/>
+        </w:rPr>
+        <w:t/>
+      </w:r>
+      <w:r>
+        <w:rPr>
+          <w:rFonts w:ascii="Calibri" w:hAnsi="Calibri" w:eastAsia="Calibri"/>
+          <w:b w:val="0"/>
+          <w:sz w:val="22"/>
+        </w:rPr>
+        <w:t/>
       </w:r>
     </w:p>
     <w:p>
@@ -5082,7 +5571,7 @@
         <w:rPr>
           <w:color w:val="111827"/>
         </w:rPr>
-        <w:t>Audience Resonance — `blueprintResonance` — 30s</w:t>
+        <w:t>Direct the beats — `treatment` — 30s</w:t>
       </w:r>
     </w:p>
     <w:p>
@@ -5096,15 +5585,15 @@
           <w:b/>
           <w:sz w:val="22"/>
         </w:rPr>
-        <w:t>0:00–0:03 Picture:</w:t>
-      </w:r>
-      <w:r>
-        <w:rPr>
-          <w:rFonts w:ascii="Calibri" w:hAnsi="Calibri" w:eastAsia="Calibri"/>
-          <w:b w:val="0"/>
-          <w:sz w:val="22"/>
-        </w:rPr>
-        <w:t xml:space="preserve"> Omni </w:t>
+        <w:t>0:00–0:03 Picture: Ana, eyes on the work. Narration: Do not leave the beats wrong. Words: 6</w:t>
+      </w:r>
+      <w:r>
+        <w:rPr>
+          <w:rFonts w:ascii="Calibri" w:hAnsi="Calibri" w:eastAsia="Calibri"/>
+          <w:b w:val="0"/>
+          <w:sz w:val="22"/>
+        </w:rPr>
+        <w:t xml:space="preserve"/>
       </w:r>
       <w:r>
         <w:rPr>
@@ -5113,47 +5602,15 @@
           <w:color w:val="1E406E"/>
           <w:sz w:val="20"/>
         </w:rPr>
-        <w:t>omni-hold</w:t>
-      </w:r>
-      <w:r>
-        <w:rPr>
-          <w:rFonts w:ascii="Calibri" w:hAnsi="Calibri" w:eastAsia="Calibri"/>
-          <w:b w:val="0"/>
-          <w:sz w:val="22"/>
-        </w:rPr>
-        <w:t xml:space="preserve">, her eyes. </w:t>
-      </w:r>
-      <w:r>
-        <w:rPr>
-          <w:rFonts w:ascii="Calibri" w:hAnsi="Calibri" w:eastAsia="Calibri"/>
-          <w:b/>
-          <w:sz w:val="22"/>
-        </w:rPr>
-        <w:t>Narration:</w:t>
-      </w:r>
-      <w:r>
-        <w:rPr>
-          <w:rFonts w:ascii="Calibri" w:hAnsi="Calibri" w:eastAsia="Calibri"/>
-          <w:b w:val="0"/>
-          <w:sz w:val="22"/>
-        </w:rPr>
-        <w:t xml:space="preserve"> Will they stay with her? </w:t>
-      </w:r>
-      <w:r>
-        <w:rPr>
-          <w:rFonts w:ascii="Calibri" w:hAnsi="Calibri" w:eastAsia="Calibri"/>
-          <w:b/>
-          <w:sz w:val="22"/>
-        </w:rPr>
-        <w:t>Words:</w:t>
-      </w:r>
-      <w:r>
-        <w:rPr>
-          <w:rFonts w:ascii="Calibri" w:hAnsi="Calibri" w:eastAsia="Calibri"/>
-          <w:b w:val="0"/>
-          <w:sz w:val="22"/>
-        </w:rPr>
-        <w:t xml:space="preserve"> 5</w:t>
+        <w:t/>
+      </w:r>
+      <w:r>
+        <w:rPr>
+          <w:rFonts w:ascii="Calibri" w:hAnsi="Calibri" w:eastAsia="Calibri"/>
+          <w:b w:val="0"/>
+          <w:sz w:val="22"/>
+        </w:rPr>
+        <w:t/>
       </w:r>
     </w:p>
     <w:p>
@@ -5167,31 +5624,15 @@
           <w:b/>
           <w:sz w:val="22"/>
         </w:rPr>
-        <w:t>0:03–0:23 Picture:</w:t>
-      </w:r>
-      <w:r>
-        <w:rPr>
-          <w:rFonts w:ascii="Calibri" w:hAnsi="Calibri" w:eastAsia="Calibri"/>
-          <w:b w:val="0"/>
-          <w:sz w:val="22"/>
-        </w:rPr>
-        <w:t xml:space="preserve"> Capture. Scores for concept, tone, characters, and beats, against the audience named on the board. Recommendations sit there. No automatic rewrite. </w:t>
-      </w:r>
-      <w:r>
-        <w:rPr>
-          <w:rFonts w:ascii="Calibri" w:hAnsi="Calibri" w:eastAsia="Calibri"/>
-          <w:b/>
-          <w:sz w:val="22"/>
-        </w:rPr>
-        <w:t>Still:</w:t>
-      </w:r>
-      <w:r>
-        <w:rPr>
-          <w:rFonts w:ascii="Calibri" w:hAnsi="Calibri" w:eastAsia="Calibri"/>
-          <w:b w:val="0"/>
-          <w:sz w:val="22"/>
-        </w:rPr>
-        <w:t xml:space="preserve"> </w:t>
+        <w:t>0:03–0:23 Picture: Capture. Beats tab. Listen on. One beat sheet. No second list. Still: Beats tab, with Listen. Narration: Optimize the beats here. They drive the script. Beats exist only here. Each one becomes a chapter. Words: 17</w:t>
+      </w:r>
+      <w:r>
+        <w:rPr>
+          <w:rFonts w:ascii="Calibri" w:hAnsi="Calibri" w:eastAsia="Calibri"/>
+          <w:b w:val="0"/>
+          <w:sz w:val="22"/>
+        </w:rPr>
+        <w:t xml:space="preserve"/>
       </w:r>
       <w:r>
         <w:rPr>
@@ -5200,47 +5641,15 @@
           <w:color w:val="1E406E"/>
           <w:sz w:val="20"/>
         </w:rPr>
-        <w:t>Audience Resonance scores</w:t>
-      </w:r>
-      <w:r>
-        <w:rPr>
-          <w:rFonts w:ascii="Calibri" w:hAnsi="Calibri" w:eastAsia="Calibri"/>
-          <w:b w:val="0"/>
-          <w:sz w:val="22"/>
-        </w:rPr>
-        <w:t xml:space="preserve">. </w:t>
-      </w:r>
-      <w:r>
-        <w:rPr>
-          <w:rFonts w:ascii="Calibri" w:hAnsi="Calibri" w:eastAsia="Calibri"/>
-          <w:b/>
-          <w:sz w:val="22"/>
-        </w:rPr>
-        <w:t>Narration:</w:t>
-      </w:r>
-      <w:r>
-        <w:rPr>
-          <w:rFonts w:ascii="Calibri" w:hAnsi="Calibri" w:eastAsia="Calibri"/>
-          <w:b w:val="0"/>
-          <w:sz w:val="22"/>
-        </w:rPr>
-        <w:t xml:space="preserve"> Score the board before anyone spends on pictures. You see the score. You see the notes. You choose what to revise. </w:t>
-      </w:r>
-      <w:r>
-        <w:rPr>
-          <w:rFonts w:ascii="Calibri" w:hAnsi="Calibri" w:eastAsia="Calibri"/>
-          <w:b/>
-          <w:sz w:val="22"/>
-        </w:rPr>
-        <w:t>Words:</w:t>
-      </w:r>
-      <w:r>
-        <w:rPr>
-          <w:rFonts w:ascii="Calibri" w:hAnsi="Calibri" w:eastAsia="Calibri"/>
-          <w:b w:val="0"/>
-          <w:sz w:val="22"/>
-        </w:rPr>
-        <w:t xml:space="preserve"> 21</w:t>
+        <w:t/>
+      </w:r>
+      <w:r>
+        <w:rPr>
+          <w:rFonts w:ascii="Calibri" w:hAnsi="Calibri" w:eastAsia="Calibri"/>
+          <w:b w:val="0"/>
+          <w:sz w:val="22"/>
+        </w:rPr>
+        <w:t/>
       </w:r>
     </w:p>
     <w:p>
@@ -5254,15 +5663,15 @@
           <w:b/>
           <w:sz w:val="22"/>
         </w:rPr>
-        <w:t>0:23–0:30 Picture:</w:t>
-      </w:r>
-      <w:r>
-        <w:rPr>
-          <w:rFonts w:ascii="Calibri" w:hAnsi="Calibri" w:eastAsia="Calibri"/>
-          <w:b w:val="0"/>
-          <w:sz w:val="22"/>
-        </w:rPr>
-        <w:t xml:space="preserve"> The score, held, then Omni </w:t>
+        <w:t>0:23–0:30 Picture: The beat sheet, held. Narration: The script is built from these. Words: 6</w:t>
+      </w:r>
+      <w:r>
+        <w:rPr>
+          <w:rFonts w:ascii="Calibri" w:hAnsi="Calibri" w:eastAsia="Calibri"/>
+          <w:b w:val="0"/>
+          <w:sz w:val="22"/>
+        </w:rPr>
+        <w:t xml:space="preserve"/>
       </w:r>
       <w:r>
         <w:rPr>
@@ -5271,47 +5680,15 @@
           <w:color w:val="1E406E"/>
           <w:sz w:val="20"/>
         </w:rPr>
-        <w:t>omni-door</w:t>
-      </w:r>
-      <w:r>
-        <w:rPr>
-          <w:rFonts w:ascii="Calibri" w:hAnsi="Calibri" w:eastAsia="Calibri"/>
-          <w:b w:val="0"/>
-          <w:sz w:val="22"/>
-        </w:rPr>
-        <w:t xml:space="preserve"> for the last two seconds. </w:t>
-      </w:r>
-      <w:r>
-        <w:rPr>
-          <w:rFonts w:ascii="Calibri" w:hAnsi="Calibri" w:eastAsia="Calibri"/>
-          <w:b/>
-          <w:sz w:val="22"/>
-        </w:rPr>
-        <w:t>Narration:</w:t>
-      </w:r>
-      <w:r>
-        <w:rPr>
-          <w:rFonts w:ascii="Calibri" w:hAnsi="Calibri" w:eastAsia="Calibri"/>
-          <w:b w:val="0"/>
-          <w:sz w:val="22"/>
-        </w:rPr>
-        <w:t xml:space="preserve"> Picture spend waits on you. </w:t>
-      </w:r>
-      <w:r>
-        <w:rPr>
-          <w:rFonts w:ascii="Calibri" w:hAnsi="Calibri" w:eastAsia="Calibri"/>
-          <w:b/>
-          <w:sz w:val="22"/>
-        </w:rPr>
-        <w:t>Words:</w:t>
-      </w:r>
-      <w:r>
-        <w:rPr>
-          <w:rFonts w:ascii="Calibri" w:hAnsi="Calibri" w:eastAsia="Calibri"/>
-          <w:b w:val="0"/>
-          <w:sz w:val="22"/>
-        </w:rPr>
-        <w:t xml:space="preserve"> 5</w:t>
+        <w:t/>
+      </w:r>
+      <w:r>
+        <w:rPr>
+          <w:rFonts w:ascii="Calibri" w:hAnsi="Calibri" w:eastAsia="Calibri"/>
+          <w:b w:val="0"/>
+          <w:sz w:val="22"/>
+        </w:rPr>
+        <w:t/>
       </w:r>
     </w:p>
     <w:p>
@@ -5325,31 +5702,32 @@
           <w:b/>
           <w:sz w:val="22"/>
         </w:rPr>
-        <w:t>Bed:</w:t>
-      </w:r>
-      <w:r>
-        <w:rPr>
-          <w:rFonts w:ascii="Calibri" w:hAnsi="Calibri" w:eastAsia="Calibri"/>
-          <w:b w:val="0"/>
-          <w:sz w:val="22"/>
-        </w:rPr>
-        <w:t xml:space="preserve"> Blueprint. </w:t>
-      </w:r>
-      <w:r>
-        <w:rPr>
-          <w:rFonts w:ascii="Calibri" w:hAnsi="Calibri" w:eastAsia="Calibri"/>
-          <w:b/>
-          <w:sz w:val="22"/>
-        </w:rPr>
-        <w:t>Spoken:</w:t>
-      </w:r>
-      <w:r>
-        <w:rPr>
-          <w:rFonts w:ascii="Calibri" w:hAnsi="Calibri" w:eastAsia="Calibri"/>
-          <w:b w:val="0"/>
-          <w:sz w:val="22"/>
-        </w:rPr>
-        <w:t xml:space="preserve"> 31</w:t>
+        <w:t>Bed: Blueprint. Spoken: 29</w:t>
+      </w:r>
+      <w:r>
+        <w:rPr>
+          <w:rFonts w:ascii="Calibri" w:hAnsi="Calibri" w:eastAsia="Calibri"/>
+          <w:b w:val="0"/>
+          <w:sz w:val="22"/>
+        </w:rPr>
+        <w:t xml:space="preserve"/>
+      </w:r>
+      <w:r>
+        <w:rPr>
+          <w:rFonts w:ascii="Consolas" w:hAnsi="Consolas" w:eastAsia="Consolas"/>
+          <w:b w:val="0"/>
+          <w:color w:val="1E406E"/>
+          <w:sz w:val="20"/>
+        </w:rPr>
+        <w:t/>
+      </w:r>
+      <w:r>
+        <w:rPr>
+          <w:rFonts w:ascii="Calibri" w:hAnsi="Calibri" w:eastAsia="Calibri"/>
+          <w:b w:val="0"/>
+          <w:sz w:val="22"/>
+        </w:rPr>
+        <w:t/>
       </w:r>
     </w:p>
     <w:p>
@@ -5361,7 +5739,7 @@
         <w:rPr>
           <w:color w:val="111827"/>
         </w:rPr>
-        <w:t>Stakeholder review — `stakeholderReview` — 30s</w:t>
+        <w:t>Direct the cast and locations — `castLocations` — 30s</w:t>
       </w:r>
     </w:p>
     <w:p>
@@ -5375,47 +5753,32 @@
           <w:b/>
           <w:sz w:val="22"/>
         </w:rPr>
-        <w:t>0:00–0:03 Picture:</w:t>
-      </w:r>
-      <w:r>
-        <w:rPr>
-          <w:rFonts w:ascii="Calibri" w:hAnsi="Calibri" w:eastAsia="Calibri"/>
-          <w:b w:val="0"/>
-          <w:sz w:val="22"/>
-        </w:rPr>
-        <w:t xml:space="preserve"> A phone, dark, then the treatment narration begins under the Omni doorway, picture only. </w:t>
-      </w:r>
-      <w:r>
-        <w:rPr>
-          <w:rFonts w:ascii="Calibri" w:hAnsi="Calibri" w:eastAsia="Calibri"/>
-          <w:b/>
-          <w:sz w:val="22"/>
-        </w:rPr>
-        <w:t>Narration:</w:t>
-      </w:r>
-      <w:r>
-        <w:rPr>
-          <w:rFonts w:ascii="Calibri" w:hAnsi="Calibri" w:eastAsia="Calibri"/>
-          <w:b w:val="0"/>
-          <w:sz w:val="22"/>
-        </w:rPr>
-        <w:t xml:space="preserve"> They should hear it, not just read it. </w:t>
-      </w:r>
-      <w:r>
-        <w:rPr>
-          <w:rFonts w:ascii="Calibri" w:hAnsi="Calibri" w:eastAsia="Calibri"/>
-          <w:b/>
-          <w:sz w:val="22"/>
-        </w:rPr>
-        <w:t>Words:</w:t>
-      </w:r>
-      <w:r>
-        <w:rPr>
-          <w:rFonts w:ascii="Calibri" w:hAnsi="Calibri" w:eastAsia="Calibri"/>
-          <w:b w:val="0"/>
-          <w:sz w:val="22"/>
-        </w:rPr>
-        <w:t xml:space="preserve"> 8</w:t>
+        <w:t>0:00–0:03 Picture: Ana, a small turn toward the work. Narration: The cast shapes the script. Words: 5</w:t>
+      </w:r>
+      <w:r>
+        <w:rPr>
+          <w:rFonts w:ascii="Calibri" w:hAnsi="Calibri" w:eastAsia="Calibri"/>
+          <w:b w:val="0"/>
+          <w:sz w:val="22"/>
+        </w:rPr>
+        <w:t xml:space="preserve"/>
+      </w:r>
+      <w:r>
+        <w:rPr>
+          <w:rFonts w:ascii="Consolas" w:hAnsi="Consolas" w:eastAsia="Consolas"/>
+          <w:b w:val="0"/>
+          <w:color w:val="1E406E"/>
+          <w:sz w:val="20"/>
+        </w:rPr>
+        <w:t/>
+      </w:r>
+      <w:r>
+        <w:rPr>
+          <w:rFonts w:ascii="Calibri" w:hAnsi="Calibri" w:eastAsia="Calibri"/>
+          <w:b w:val="0"/>
+          <w:sz w:val="22"/>
+        </w:rPr>
+        <w:t/>
       </w:r>
     </w:p>
     <w:p>
@@ -5429,31 +5792,15 @@
           <w:b/>
           <w:sz w:val="22"/>
         </w:rPr>
-        <w:t>0:03–0:23 Picture:</w:t>
-      </w:r>
-      <w:r>
-        <w:rPr>
-          <w:rFonts w:ascii="Calibri" w:hAnsi="Calibri" w:eastAsia="Calibri"/>
-          <w:b w:val="0"/>
-          <w:sz w:val="22"/>
-        </w:rPr>
-        <w:t xml:space="preserve"> Capture. The share link. Same board. Narration playing. A note returns on the board. The phone shows that note. </w:t>
-      </w:r>
-      <w:r>
-        <w:rPr>
-          <w:rFonts w:ascii="Calibri" w:hAnsi="Calibri" w:eastAsia="Calibri"/>
-          <w:b/>
-          <w:sz w:val="22"/>
-        </w:rPr>
-        <w:t>Still:</w:t>
-      </w:r>
-      <w:r>
-        <w:rPr>
-          <w:rFonts w:ascii="Calibri" w:hAnsi="Calibri" w:eastAsia="Calibri"/>
-          <w:b w:val="0"/>
-          <w:sz w:val="22"/>
-        </w:rPr>
-        <w:t xml:space="preserve"> </w:t>
+        <w:t>0:03–0:23 Picture: Capture. Characters, held on the cast. Cut to Setting on Story. Still: Characters tab, then Setting on Story. Narration: Direct the cast, and the locations with them. Characters, then the setting. Production should not have to recast the story. Words: 20</w:t>
+      </w:r>
+      <w:r>
+        <w:rPr>
+          <w:rFonts w:ascii="Calibri" w:hAnsi="Calibri" w:eastAsia="Calibri"/>
+          <w:b w:val="0"/>
+          <w:sz w:val="22"/>
+        </w:rPr>
+        <w:t xml:space="preserve"/>
       </w:r>
       <w:r>
         <w:rPr>
@@ -5462,47 +5809,15 @@
           <w:color w:val="1E406E"/>
           <w:sz w:val="20"/>
         </w:rPr>
-        <w:t>Share link</w:t>
-      </w:r>
-      <w:r>
-        <w:rPr>
-          <w:rFonts w:ascii="Calibri" w:hAnsi="Calibri" w:eastAsia="Calibri"/>
-          <w:b w:val="0"/>
-          <w:sz w:val="22"/>
-        </w:rPr>
-        <w:t xml:space="preserve">. </w:t>
-      </w:r>
-      <w:r>
-        <w:rPr>
-          <w:rFonts w:ascii="Calibri" w:hAnsi="Calibri" w:eastAsia="Calibri"/>
-          <w:b/>
-          <w:sz w:val="22"/>
-        </w:rPr>
-        <w:t>Narration:</w:t>
-      </w:r>
-      <w:r>
-        <w:rPr>
-          <w:rFonts w:ascii="Calibri" w:hAnsi="Calibri" w:eastAsia="Calibri"/>
-          <w:b w:val="0"/>
-          <w:sz w:val="22"/>
-        </w:rPr>
-        <w:t xml:space="preserve"> Share the treatment. They hear the narration and see the board you see. Notes come back on the work. A new one reaches your phone. </w:t>
-      </w:r>
-      <w:r>
-        <w:rPr>
-          <w:rFonts w:ascii="Calibri" w:hAnsi="Calibri" w:eastAsia="Calibri"/>
-          <w:b/>
-          <w:sz w:val="22"/>
-        </w:rPr>
-        <w:t>Words:</w:t>
-      </w:r>
-      <w:r>
-        <w:rPr>
-          <w:rFonts w:ascii="Calibri" w:hAnsi="Calibri" w:eastAsia="Calibri"/>
-          <w:b w:val="0"/>
-          <w:sz w:val="22"/>
-        </w:rPr>
-        <w:t xml:space="preserve"> 25</w:t>
+        <w:t/>
+      </w:r>
+      <w:r>
+        <w:rPr>
+          <w:rFonts w:ascii="Calibri" w:hAnsi="Calibri" w:eastAsia="Calibri"/>
+          <w:b w:val="0"/>
+          <w:sz w:val="22"/>
+        </w:rPr>
+        <w:t/>
       </w:r>
     </w:p>
     <w:p>
@@ -5516,47 +5831,32 @@
           <w:b/>
           <w:sz w:val="22"/>
         </w:rPr>
-        <w:t>0:23–0:30 Picture:</w:t>
-      </w:r>
-      <w:r>
-        <w:rPr>
-          <w:rFonts w:ascii="Calibri" w:hAnsi="Calibri" w:eastAsia="Calibri"/>
-          <w:b w:val="0"/>
-          <w:sz w:val="22"/>
-        </w:rPr>
-        <w:t xml:space="preserve"> The note, held on the board. </w:t>
-      </w:r>
-      <w:r>
-        <w:rPr>
-          <w:rFonts w:ascii="Calibri" w:hAnsi="Calibri" w:eastAsia="Calibri"/>
-          <w:b/>
-          <w:sz w:val="22"/>
-        </w:rPr>
-        <w:t>Narration:</w:t>
-      </w:r>
-      <w:r>
-        <w:rPr>
-          <w:rFonts w:ascii="Calibri" w:hAnsi="Calibri" w:eastAsia="Calibri"/>
-          <w:b w:val="0"/>
-          <w:sz w:val="22"/>
-        </w:rPr>
-        <w:t xml:space="preserve"> Not a document in another tool. </w:t>
-      </w:r>
-      <w:r>
-        <w:rPr>
-          <w:rFonts w:ascii="Calibri" w:hAnsi="Calibri" w:eastAsia="Calibri"/>
-          <w:b/>
-          <w:sz w:val="22"/>
-        </w:rPr>
-        <w:t>Words:</w:t>
-      </w:r>
-      <w:r>
-        <w:rPr>
-          <w:rFonts w:ascii="Calibri" w:hAnsi="Calibri" w:eastAsia="Calibri"/>
-          <w:b w:val="0"/>
-          <w:sz w:val="22"/>
-        </w:rPr>
-        <w:t xml:space="preserve"> 6</w:t>
+        <w:t>0:23–0:30 Picture: The same cast, held. Narration: Same people. Same places. Words: 4</w:t>
+      </w:r>
+      <w:r>
+        <w:rPr>
+          <w:rFonts w:ascii="Calibri" w:hAnsi="Calibri" w:eastAsia="Calibri"/>
+          <w:b w:val="0"/>
+          <w:sz w:val="22"/>
+        </w:rPr>
+        <w:t xml:space="preserve"/>
+      </w:r>
+      <w:r>
+        <w:rPr>
+          <w:rFonts w:ascii="Consolas" w:hAnsi="Consolas" w:eastAsia="Consolas"/>
+          <w:b w:val="0"/>
+          <w:color w:val="1E406E"/>
+          <w:sz w:val="20"/>
+        </w:rPr>
+        <w:t/>
+      </w:r>
+      <w:r>
+        <w:rPr>
+          <w:rFonts w:ascii="Calibri" w:hAnsi="Calibri" w:eastAsia="Calibri"/>
+          <w:b w:val="0"/>
+          <w:sz w:val="22"/>
+        </w:rPr>
+        <w:t/>
       </w:r>
     </w:p>
     <w:p>
@@ -5570,44 +5870,368 @@
           <w:b/>
           <w:sz w:val="22"/>
         </w:rPr>
-        <w:t>Bed:</w:t>
-      </w:r>
-      <w:r>
-        <w:rPr>
-          <w:rFonts w:ascii="Calibri" w:hAnsi="Calibri" w:eastAsia="Calibri"/>
-          <w:b w:val="0"/>
-          <w:sz w:val="22"/>
-        </w:rPr>
-        <w:t xml:space="preserve"> Blueprint. </w:t>
-      </w:r>
-      <w:r>
-        <w:rPr>
-          <w:rFonts w:ascii="Calibri" w:hAnsi="Calibri" w:eastAsia="Calibri"/>
-          <w:b/>
-          <w:sz w:val="22"/>
-        </w:rPr>
-        <w:t>Spoken:</w:t>
-      </w:r>
-      <w:r>
-        <w:rPr>
-          <w:rFonts w:ascii="Calibri" w:hAnsi="Calibri" w:eastAsia="Calibri"/>
-          <w:b w:val="0"/>
-          <w:sz w:val="22"/>
-        </w:rPr>
-        <w:t xml:space="preserve"> 39</w:t>
+        <w:t>Bed: Blueprint. Spoken: 29</w:t>
+      </w:r>
+      <w:r>
+        <w:rPr>
+          <w:rFonts w:ascii="Calibri" w:hAnsi="Calibri" w:eastAsia="Calibri"/>
+          <w:b w:val="0"/>
+          <w:sz w:val="22"/>
+        </w:rPr>
+        <w:t xml:space="preserve"/>
+      </w:r>
+      <w:r>
+        <w:rPr>
+          <w:rFonts w:ascii="Consolas" w:hAnsi="Consolas" w:eastAsia="Consolas"/>
+          <w:b w:val="0"/>
+          <w:color w:val="1E406E"/>
+          <w:sz w:val="20"/>
+        </w:rPr>
+        <w:t/>
+      </w:r>
+      <w:r>
+        <w:rPr>
+          <w:rFonts w:ascii="Calibri" w:hAnsi="Calibri" w:eastAsia="Calibri"/>
+          <w:b w:val="0"/>
+          <w:sz w:val="22"/>
+        </w:rPr>
+        <w:t/>
       </w:r>
     </w:p>
     <w:p>
       <w:pPr>
-        <w:spacing w:before="0" w:after="160" w:line="259" w:lineRule="auto"/>
-      </w:pPr>
-      <w:r>
-        <w:rPr>
-          <w:rFonts w:ascii="Calibri" w:hAnsi="Calibri" w:eastAsia="Calibri"/>
-          <w:b w:val="0"/>
-          <w:sz w:val="22"/>
-        </w:rPr>
-        <w:t>Co-Director has no demo. The Series Director demo is the gesture, and it also covers Direct this episode. The Blueprint room film carries the one line about keeping locked art. Start the episode is spoken in the Series Room film, at 1:18. It has no separate 30-second file.</w:t>
+        <w:pStyle w:val="Heading3"/>
+        <w:spacing w:before="240" w:after="120"/>
+      </w:pPr>
+      <w:r>
+        <w:rPr>
+          <w:color w:val="111827"/>
+        </w:rPr>
+        <w:t>Blueprint Director — `blueprintDirector` — 30s</w:t>
+      </w:r>
+    </w:p>
+    <w:p>
+      <w:pPr>
+        <w:pStyle w:val="ListBullet"/>
+        <w:spacing w:before="0" w:after="60" w:line="259" w:lineRule="auto"/>
+      </w:pPr>
+      <w:r>
+        <w:rPr>
+          <w:rFonts w:ascii="Calibri" w:hAnsi="Calibri" w:eastAsia="Calibri"/>
+          <w:b/>
+          <w:sz w:val="22"/>
+        </w:rPr>
+        <w:t>0:00–0:03 Picture: Ana, calm, a small nod. Narration: You direct the blueprint. Words: 4</w:t>
+      </w:r>
+      <w:r>
+        <w:rPr>
+          <w:rFonts w:ascii="Calibri" w:hAnsi="Calibri" w:eastAsia="Calibri"/>
+          <w:b w:val="0"/>
+          <w:sz w:val="22"/>
+        </w:rPr>
+        <w:t xml:space="preserve"/>
+      </w:r>
+      <w:r>
+        <w:rPr>
+          <w:rFonts w:ascii="Consolas" w:hAnsi="Consolas" w:eastAsia="Consolas"/>
+          <w:b w:val="0"/>
+          <w:color w:val="1E406E"/>
+          <w:sz w:val="20"/>
+        </w:rPr>
+        <w:t/>
+      </w:r>
+      <w:r>
+        <w:rPr>
+          <w:rFonts w:ascii="Calibri" w:hAnsi="Calibri" w:eastAsia="Calibri"/>
+          <w:b w:val="0"/>
+          <w:sz w:val="22"/>
+        </w:rPr>
+        <w:t/>
+      </w:r>
+    </w:p>
+    <w:p>
+      <w:pPr>
+        <w:pStyle w:val="ListBullet"/>
+        <w:spacing w:before="0" w:after="60" w:line="259" w:lineRule="auto"/>
+      </w:pPr>
+      <w:r>
+        <w:rPr>
+          <w:rFonts w:ascii="Calibri" w:hAnsi="Calibri" w:eastAsia="Calibri"/>
+          <w:b/>
+          <w:sz w:val="22"/>
+        </w:rPr>
+        <w:t>0:03–0:23 Picture: Capture. Blueprint Director. Spoken or typed direction. Focus on Beats, Characters, or Story. Preview, then Apply revision. Still: Blueprint Director — direction, focus, preview, Apply revision. Narration: Blueprint Director. Say the change. Focus the beats, the cast, or the story. Preview it, then apply it. Words: 18</w:t>
+      </w:r>
+      <w:r>
+        <w:rPr>
+          <w:rFonts w:ascii="Calibri" w:hAnsi="Calibri" w:eastAsia="Calibri"/>
+          <w:b w:val="0"/>
+          <w:sz w:val="22"/>
+        </w:rPr>
+        <w:t xml:space="preserve"/>
+      </w:r>
+      <w:r>
+        <w:rPr>
+          <w:rFonts w:ascii="Consolas" w:hAnsi="Consolas" w:eastAsia="Consolas"/>
+          <w:b w:val="0"/>
+          <w:color w:val="1E406E"/>
+          <w:sz w:val="20"/>
+        </w:rPr>
+        <w:t/>
+      </w:r>
+      <w:r>
+        <w:rPr>
+          <w:rFonts w:ascii="Calibri" w:hAnsi="Calibri" w:eastAsia="Calibri"/>
+          <w:b w:val="0"/>
+          <w:sz w:val="22"/>
+        </w:rPr>
+        <w:t/>
+      </w:r>
+    </w:p>
+    <w:p>
+      <w:pPr>
+        <w:pStyle w:val="ListBullet"/>
+        <w:spacing w:before="0" w:after="60" w:line="259" w:lineRule="auto"/>
+      </w:pPr>
+      <w:r>
+        <w:rPr>
+          <w:rFonts w:ascii="Calibri" w:hAnsi="Calibri" w:eastAsia="Calibri"/>
+          <w:b/>
+          <w:sz w:val="22"/>
+        </w:rPr>
+        <w:t>0:23–0:30 Picture: The applied revision, held. Narration: Nothing moves until you do. Words: 5</w:t>
+      </w:r>
+      <w:r>
+        <w:rPr>
+          <w:rFonts w:ascii="Calibri" w:hAnsi="Calibri" w:eastAsia="Calibri"/>
+          <w:b w:val="0"/>
+          <w:sz w:val="22"/>
+        </w:rPr>
+        <w:t xml:space="preserve"/>
+      </w:r>
+      <w:r>
+        <w:rPr>
+          <w:rFonts w:ascii="Consolas" w:hAnsi="Consolas" w:eastAsia="Consolas"/>
+          <w:b w:val="0"/>
+          <w:color w:val="1E406E"/>
+          <w:sz w:val="20"/>
+        </w:rPr>
+        <w:t/>
+      </w:r>
+      <w:r>
+        <w:rPr>
+          <w:rFonts w:ascii="Calibri" w:hAnsi="Calibri" w:eastAsia="Calibri"/>
+          <w:b w:val="0"/>
+          <w:sz w:val="22"/>
+        </w:rPr>
+        <w:t/>
+      </w:r>
+    </w:p>
+    <w:p>
+      <w:pPr>
+        <w:pStyle w:val="ListBullet"/>
+        <w:spacing w:before="0" w:after="60" w:line="259" w:lineRule="auto"/>
+      </w:pPr>
+      <w:r>
+        <w:rPr>
+          <w:rFonts w:ascii="Calibri" w:hAnsi="Calibri" w:eastAsia="Calibri"/>
+          <w:b/>
+          <w:sz w:val="22"/>
+        </w:rPr>
+        <w:t>Bed: Blueprint. Spoken: 27</w:t>
+      </w:r>
+      <w:r>
+        <w:rPr>
+          <w:rFonts w:ascii="Calibri" w:hAnsi="Calibri" w:eastAsia="Calibri"/>
+          <w:b w:val="0"/>
+          <w:sz w:val="22"/>
+        </w:rPr>
+        <w:t xml:space="preserve"/>
+      </w:r>
+      <w:r>
+        <w:rPr>
+          <w:rFonts w:ascii="Consolas" w:hAnsi="Consolas" w:eastAsia="Consolas"/>
+          <w:b w:val="0"/>
+          <w:color w:val="1E406E"/>
+          <w:sz w:val="20"/>
+        </w:rPr>
+        <w:t/>
+      </w:r>
+      <w:r>
+        <w:rPr>
+          <w:rFonts w:ascii="Calibri" w:hAnsi="Calibri" w:eastAsia="Calibri"/>
+          <w:b w:val="0"/>
+          <w:sz w:val="22"/>
+        </w:rPr>
+        <w:t/>
+      </w:r>
+    </w:p>
+    <w:p>
+      <w:pPr>
+        <w:pStyle w:val="Heading3"/>
+        <w:spacing w:before="240" w:after="120"/>
+      </w:pPr>
+      <w:r>
+        <w:rPr>
+          <w:color w:val="111827"/>
+        </w:rPr>
+        <w:t>Audience Resonance — `blueprintResonance` — 30s</w:t>
+      </w:r>
+    </w:p>
+    <w:p>
+      <w:pPr>
+        <w:pStyle w:val="ListBullet"/>
+        <w:spacing w:before="0" w:after="60" w:line="259" w:lineRule="auto"/>
+      </w:pPr>
+      <w:r>
+        <w:rPr>
+          <w:rFonts w:ascii="Calibri" w:hAnsi="Calibri" w:eastAsia="Calibri"/>
+          <w:b/>
+          <w:sz w:val="22"/>
+        </w:rPr>
+        <w:t>0:00–0:03 Picture: Ana, eyes on the work, no interface. Narration: Will this story hold them? Words: 5</w:t>
+      </w:r>
+      <w:r>
+        <w:rPr>
+          <w:rFonts w:ascii="Calibri" w:hAnsi="Calibri" w:eastAsia="Calibri"/>
+          <w:b w:val="0"/>
+          <w:sz w:val="22"/>
+        </w:rPr>
+        <w:t xml:space="preserve"/>
+      </w:r>
+      <w:r>
+        <w:rPr>
+          <w:rFonts w:ascii="Consolas" w:hAnsi="Consolas" w:eastAsia="Consolas"/>
+          <w:b w:val="0"/>
+          <w:color w:val="1E406E"/>
+          <w:sz w:val="20"/>
+        </w:rPr>
+        <w:t/>
+      </w:r>
+      <w:r>
+        <w:rPr>
+          <w:rFonts w:ascii="Calibri" w:hAnsi="Calibri" w:eastAsia="Calibri"/>
+          <w:b w:val="0"/>
+          <w:sz w:val="22"/>
+        </w:rPr>
+        <w:t/>
+      </w:r>
+    </w:p>
+    <w:p>
+      <w:pPr>
+        <w:pStyle w:val="ListBullet"/>
+        <w:spacing w:before="0" w:after="60" w:line="259" w:lineRule="auto"/>
+      </w:pPr>
+      <w:r>
+        <w:rPr>
+          <w:rFonts w:ascii="Calibri" w:hAnsi="Calibri" w:eastAsia="Calibri"/>
+          <w:b/>
+          <w:sz w:val="22"/>
+        </w:rPr>
+        <w:t>0:03–0:23 Picture: Capture. Saved audience, scores, recommendations. She does not apply one. Still: Audience Resonance — saved audience, scores, recommendations unapplied. Narration: Run Audience Resonance. Read the scores. Apply a note only if you choose to. Nothing moves until you do. Words: 19</w:t>
+      </w:r>
+      <w:r>
+        <w:rPr>
+          <w:rFonts w:ascii="Calibri" w:hAnsi="Calibri" w:eastAsia="Calibri"/>
+          <w:b w:val="0"/>
+          <w:sz w:val="22"/>
+        </w:rPr>
+        <w:t xml:space="preserve"/>
+      </w:r>
+      <w:r>
+        <w:rPr>
+          <w:rFonts w:ascii="Consolas" w:hAnsi="Consolas" w:eastAsia="Consolas"/>
+          <w:b w:val="0"/>
+          <w:color w:val="1E406E"/>
+          <w:sz w:val="20"/>
+        </w:rPr>
+        <w:t/>
+      </w:r>
+      <w:r>
+        <w:rPr>
+          <w:rFonts w:ascii="Calibri" w:hAnsi="Calibri" w:eastAsia="Calibri"/>
+          <w:b w:val="0"/>
+          <w:sz w:val="22"/>
+        </w:rPr>
+        <w:t/>
+      </w:r>
+    </w:p>
+    <w:p>
+      <w:pPr>
+        <w:pStyle w:val="ListBullet"/>
+        <w:spacing w:before="0" w:after="60" w:line="259" w:lineRule="auto"/>
+      </w:pPr>
+      <w:r>
+        <w:rPr>
+          <w:rFonts w:ascii="Calibri" w:hAnsi="Calibri" w:eastAsia="Calibri"/>
+          <w:b/>
+          <w:sz w:val="22"/>
+        </w:rPr>
+        <w:t>0:23–0:30 Picture: The recommendation, held, unapplied. Narration: You decide. Words: 2</w:t>
+      </w:r>
+      <w:r>
+        <w:rPr>
+          <w:rFonts w:ascii="Calibri" w:hAnsi="Calibri" w:eastAsia="Calibri"/>
+          <w:b w:val="0"/>
+          <w:sz w:val="22"/>
+        </w:rPr>
+        <w:t xml:space="preserve"/>
+      </w:r>
+      <w:r>
+        <w:rPr>
+          <w:rFonts w:ascii="Consolas" w:hAnsi="Consolas" w:eastAsia="Consolas"/>
+          <w:b w:val="0"/>
+          <w:color w:val="1E406E"/>
+          <w:sz w:val="20"/>
+        </w:rPr>
+        <w:t/>
+      </w:r>
+      <w:r>
+        <w:rPr>
+          <w:rFonts w:ascii="Calibri" w:hAnsi="Calibri" w:eastAsia="Calibri"/>
+          <w:b w:val="0"/>
+          <w:sz w:val="22"/>
+        </w:rPr>
+        <w:t/>
+      </w:r>
+    </w:p>
+    <w:p>
+      <w:pPr>
+        <w:pStyle w:val="ListBullet"/>
+        <w:spacing w:before="0" w:after="60" w:line="259" w:lineRule="auto"/>
+      </w:pPr>
+      <w:r>
+        <w:rPr>
+          <w:rFonts w:ascii="Calibri" w:hAnsi="Calibri" w:eastAsia="Calibri"/>
+          <w:b/>
+          <w:sz w:val="22"/>
+        </w:rPr>
+        <w:t>Bed: Blueprint. Spoken: 26</w:t>
+      </w:r>
+      <w:r>
+        <w:rPr>
+          <w:rFonts w:ascii="Calibri" w:hAnsi="Calibri" w:eastAsia="Calibri"/>
+          <w:b w:val="0"/>
+          <w:sz w:val="22"/>
+        </w:rPr>
+        <w:t xml:space="preserve"/>
+      </w:r>
+      <w:r>
+        <w:rPr>
+          <w:rFonts w:ascii="Consolas" w:hAnsi="Consolas" w:eastAsia="Consolas"/>
+          <w:b w:val="0"/>
+          <w:color w:val="1E406E"/>
+          <w:sz w:val="20"/>
+        </w:rPr>
+        <w:t/>
+      </w:r>
+      <w:r>
+        <w:rPr>
+          <w:rFonts w:ascii="Calibri" w:hAnsi="Calibri" w:eastAsia="Calibri"/>
+          <w:b w:val="0"/>
+          <w:sz w:val="22"/>
+        </w:rPr>
+        <w:t/>
       </w:r>
     </w:p>
     <w:p>
@@ -7717,7 +8341,7 @@
                 <w:b w:val="0"/>
                 <w:sz w:val="20"/>
               </w:rPr>
-              <w:t>Co-Director · Blueprint</w:t>
+              <w:t>Go to Production Stage</w:t>
             </w:r>
           </w:p>
         </w:tc>
@@ -7730,7 +8354,7 @@
               <w:spacing w:before="40" w:after="40" w:line="259" w:lineRule="auto"/>
             </w:pPr>
             <w:r>
-              <w:t>Blueprint room film, 0:46. Same gesture as Series Director.</w:t>
+              <w:t>Blueprint room film, 1:08. Share has no separate demo.</w:t>
             </w:r>
             <w:r>
               <w:rPr>
@@ -9018,7 +9642,7 @@
                 <w:b w:val="0"/>
                 <w:sz w:val="20"/>
               </w:rPr>
-              <w:t>Treatment</w:t>
+              <w:t>Start the Blueprint</w:t>
             </w:r>
           </w:p>
         </w:tc>
@@ -9038,7 +9662,7 @@
                 <w:b w:val="0"/>
                 <w:sz w:val="20"/>
               </w:rPr>
-              <w:t xml:space="preserve">feature demo </w:t>
+              <w:t xml:space="preserve">feature demo startBlueprint</w:t>
             </w:r>
             <w:r>
               <w:rPr>
@@ -9047,7 +9671,280 @@
                 <w:color w:val="1E406E"/>
                 <w:sz w:val="20"/>
               </w:rPr>
-              <w:t>treatment</w:t>
+              <w:t/>
+            </w:r>
+          </w:p>
+        </w:tc>
+        <w:tc>
+          <w:tcPr>
+            <w:tcW w:type="dxa" w:w="2412"/>
+            <w:shd w:fill="F3F4F6" w:val="clear"/>
+          </w:tcPr>
+          <w:p>
+            <w:pPr>
+              <w:spacing w:before="40" w:after="40" w:line="259" w:lineRule="auto"/>
+            </w:pPr>
+            <w:r/>
+            <w:r>
+              <w:rPr>
+                <w:rFonts w:ascii="Calibri" w:hAnsi="Calibri" w:eastAsia="Calibri"/>
+                <w:b w:val="0"/>
+                <w:sz w:val="20"/>
+              </w:rPr>
+              <w:t>30s</w:t>
+            </w:r>
+          </w:p>
+        </w:tc>
+        <w:tc>
+          <w:tcPr>
+            <w:tcW w:type="dxa" w:w="2412"/>
+            <w:shd w:fill="F3F4F6" w:val="clear"/>
+          </w:tcPr>
+          <w:p>
+            <w:pPr>
+              <w:spacing w:before="40" w:after="40" w:line="259" w:lineRule="auto"/>
+            </w:pPr>
+            <w:r/>
+            <w:r>
+              <w:rPr>
+                <w:rFonts w:ascii="Calibri" w:hAnsi="Calibri" w:eastAsia="Calibri"/>
+                <w:b w:val="0"/>
+                <w:sz w:val="20"/>
+              </w:rPr>
+              <w:t>Blueprint</w:t>
+            </w:r>
+          </w:p>
+        </w:tc>
+      </w:tr>
+      <w:tr>
+        <w:tc>
+          <w:tcPr>
+            <w:tcW w:type="dxa" w:w="2412"/>
+            <w:shd w:fill="F3F4F6" w:val="clear"/>
+          </w:tcPr>
+          <w:p>
+            <w:pPr>
+              <w:spacing w:before="40" w:after="40" w:line="259" w:lineRule="auto"/>
+            </w:pPr>
+            <w:r/>
+            <w:r>
+              <w:rPr>
+                <w:rFonts w:ascii="Calibri" w:hAnsi="Calibri" w:eastAsia="Calibri"/>
+                <w:b w:val="0"/>
+                <w:sz w:val="20"/>
+              </w:rPr>
+              <w:t>Direct the beats</w:t>
+            </w:r>
+          </w:p>
+        </w:tc>
+        <w:tc>
+          <w:tcPr>
+            <w:tcW w:type="dxa" w:w="2412"/>
+            <w:shd w:fill="F3F4F6" w:val="clear"/>
+          </w:tcPr>
+          <w:p>
+            <w:pPr>
+              <w:spacing w:before="40" w:after="40" w:line="259" w:lineRule="auto"/>
+            </w:pPr>
+            <w:r/>
+            <w:r>
+              <w:rPr>
+                <w:rFonts w:ascii="Calibri" w:hAnsi="Calibri" w:eastAsia="Calibri"/>
+                <w:b w:val="0"/>
+                <w:sz w:val="20"/>
+              </w:rPr>
+              <w:t xml:space="preserve">feature demo treatment</w:t>
+            </w:r>
+            <w:r>
+              <w:rPr>
+                <w:rFonts w:ascii="Consolas" w:hAnsi="Consolas" w:eastAsia="Consolas"/>
+                <w:b w:val="0"/>
+                <w:color w:val="1E406E"/>
+                <w:sz w:val="20"/>
+              </w:rPr>
+              <w:t/>
+            </w:r>
+          </w:p>
+        </w:tc>
+        <w:tc>
+          <w:tcPr>
+            <w:tcW w:type="dxa" w:w="2412"/>
+            <w:shd w:fill="F3F4F6" w:val="clear"/>
+          </w:tcPr>
+          <w:p>
+            <w:pPr>
+              <w:spacing w:before="40" w:after="40" w:line="259" w:lineRule="auto"/>
+            </w:pPr>
+            <w:r/>
+            <w:r>
+              <w:rPr>
+                <w:rFonts w:ascii="Calibri" w:hAnsi="Calibri" w:eastAsia="Calibri"/>
+                <w:b w:val="0"/>
+                <w:sz w:val="20"/>
+              </w:rPr>
+              <w:t>30s</w:t>
+            </w:r>
+          </w:p>
+        </w:tc>
+        <w:tc>
+          <w:tcPr>
+            <w:tcW w:type="dxa" w:w="2412"/>
+            <w:shd w:fill="F3F4F6" w:val="clear"/>
+          </w:tcPr>
+          <w:p>
+            <w:pPr>
+              <w:spacing w:before="40" w:after="40" w:line="259" w:lineRule="auto"/>
+            </w:pPr>
+            <w:r/>
+            <w:r>
+              <w:rPr>
+                <w:rFonts w:ascii="Calibri" w:hAnsi="Calibri" w:eastAsia="Calibri"/>
+                <w:b w:val="0"/>
+                <w:sz w:val="20"/>
+              </w:rPr>
+              <w:t>Blueprint</w:t>
+            </w:r>
+          </w:p>
+        </w:tc>
+      </w:tr>
+      <w:tr>
+        <w:tc>
+          <w:tcPr>
+            <w:tcW w:type="dxa" w:w="2412"/>
+            <w:shd w:fill="F3F4F6" w:val="clear"/>
+          </w:tcPr>
+          <w:p>
+            <w:pPr>
+              <w:spacing w:before="40" w:after="40" w:line="259" w:lineRule="auto"/>
+            </w:pPr>
+            <w:r/>
+            <w:r>
+              <w:rPr>
+                <w:rFonts w:ascii="Calibri" w:hAnsi="Calibri" w:eastAsia="Calibri"/>
+                <w:b w:val="0"/>
+                <w:sz w:val="20"/>
+              </w:rPr>
+              <w:t>Direct the cast and locations</w:t>
+            </w:r>
+          </w:p>
+        </w:tc>
+        <w:tc>
+          <w:tcPr>
+            <w:tcW w:type="dxa" w:w="2412"/>
+            <w:shd w:fill="F3F4F6" w:val="clear"/>
+          </w:tcPr>
+          <w:p>
+            <w:pPr>
+              <w:spacing w:before="40" w:after="40" w:line="259" w:lineRule="auto"/>
+            </w:pPr>
+            <w:r/>
+            <w:r>
+              <w:rPr>
+                <w:rFonts w:ascii="Calibri" w:hAnsi="Calibri" w:eastAsia="Calibri"/>
+                <w:b w:val="0"/>
+                <w:sz w:val="20"/>
+              </w:rPr>
+              <w:t xml:space="preserve">feature demo castLocations</w:t>
+            </w:r>
+            <w:r>
+              <w:rPr>
+                <w:rFonts w:ascii="Consolas" w:hAnsi="Consolas" w:eastAsia="Consolas"/>
+                <w:b w:val="0"/>
+                <w:color w:val="1E406E"/>
+                <w:sz w:val="20"/>
+              </w:rPr>
+              <w:t/>
+            </w:r>
+          </w:p>
+        </w:tc>
+        <w:tc>
+          <w:tcPr>
+            <w:tcW w:type="dxa" w:w="2412"/>
+            <w:shd w:fill="F3F4F6" w:val="clear"/>
+          </w:tcPr>
+          <w:p>
+            <w:pPr>
+              <w:spacing w:before="40" w:after="40" w:line="259" w:lineRule="auto"/>
+            </w:pPr>
+            <w:r/>
+            <w:r>
+              <w:rPr>
+                <w:rFonts w:ascii="Calibri" w:hAnsi="Calibri" w:eastAsia="Calibri"/>
+                <w:b w:val="0"/>
+                <w:sz w:val="20"/>
+              </w:rPr>
+              <w:t>30s</w:t>
+            </w:r>
+          </w:p>
+        </w:tc>
+        <w:tc>
+          <w:tcPr>
+            <w:tcW w:type="dxa" w:w="2412"/>
+            <w:shd w:fill="F3F4F6" w:val="clear"/>
+          </w:tcPr>
+          <w:p>
+            <w:pPr>
+              <w:spacing w:before="40" w:after="40" w:line="259" w:lineRule="auto"/>
+            </w:pPr>
+            <w:r/>
+            <w:r>
+              <w:rPr>
+                <w:rFonts w:ascii="Calibri" w:hAnsi="Calibri" w:eastAsia="Calibri"/>
+                <w:b w:val="0"/>
+                <w:sz w:val="20"/>
+              </w:rPr>
+              <w:t>Blueprint</w:t>
+            </w:r>
+          </w:p>
+        </w:tc>
+      </w:tr>
+      <w:tr>
+        <w:tc>
+          <w:tcPr>
+            <w:tcW w:type="dxa" w:w="2412"/>
+            <w:shd w:fill="F3F4F6" w:val="clear"/>
+          </w:tcPr>
+          <w:p>
+            <w:pPr>
+              <w:spacing w:before="40" w:after="40" w:line="259" w:lineRule="auto"/>
+            </w:pPr>
+            <w:r/>
+            <w:r>
+              <w:rPr>
+                <w:rFonts w:ascii="Calibri" w:hAnsi="Calibri" w:eastAsia="Calibri"/>
+                <w:b w:val="0"/>
+                <w:sz w:val="20"/>
+              </w:rPr>
+              <w:t>Blueprint Director</w:t>
+            </w:r>
+          </w:p>
+        </w:tc>
+        <w:tc>
+          <w:tcPr>
+            <w:tcW w:type="dxa" w:w="2412"/>
+            <w:shd w:fill="F3F4F6" w:val="clear"/>
+          </w:tcPr>
+          <w:p>
+            <w:pPr>
+              <w:spacing w:before="40" w:after="40" w:line="259" w:lineRule="auto"/>
+            </w:pPr>
+            <w:r/>
+            <w:r>
+              <w:rPr>
+                <w:rFonts w:ascii="Calibri" w:hAnsi="Calibri" w:eastAsia="Calibri"/>
+                <w:b w:val="0"/>
+                <w:sz w:val="20"/>
+              </w:rPr>
+              <w:t xml:space="preserve">feature demo blueprintDirector</w:t>
+            </w:r>
+            <w:r>
+              <w:rPr>
+                <w:rFonts w:ascii="Consolas" w:hAnsi="Consolas" w:eastAsia="Consolas"/>
+                <w:b w:val="0"/>
+                <w:color w:val="1E406E"/>
+                <w:sz w:val="20"/>
+              </w:rPr>
+              <w:t/>
             </w:r>
           </w:p>
         </w:tc>
@@ -9162,97 +10059,6 @@
         <w:tc>
           <w:tcPr>
             <w:tcW w:type="dxa" w:w="2412"/>
-          </w:tcPr>
-          <w:p>
-            <w:pPr>
-              <w:spacing w:before="40" w:after="40" w:line="259" w:lineRule="auto"/>
-            </w:pPr>
-            <w:r/>
-            <w:r>
-              <w:rPr>
-                <w:rFonts w:ascii="Calibri" w:hAnsi="Calibri" w:eastAsia="Calibri"/>
-                <w:b w:val="0"/>
-                <w:sz w:val="20"/>
-              </w:rPr>
-              <w:t>Blueprint</w:t>
-            </w:r>
-          </w:p>
-        </w:tc>
-      </w:tr>
-      <w:tr>
-        <w:tc>
-          <w:tcPr>
-            <w:tcW w:type="dxa" w:w="2412"/>
-            <w:shd w:fill="F3F4F6" w:val="clear"/>
-          </w:tcPr>
-          <w:p>
-            <w:pPr>
-              <w:spacing w:before="40" w:after="40" w:line="259" w:lineRule="auto"/>
-            </w:pPr>
-            <w:r/>
-            <w:r>
-              <w:rPr>
-                <w:rFonts w:ascii="Calibri" w:hAnsi="Calibri" w:eastAsia="Calibri"/>
-                <w:b w:val="0"/>
-                <w:sz w:val="20"/>
-              </w:rPr>
-              <w:t>Stakeholder review</w:t>
-            </w:r>
-          </w:p>
-        </w:tc>
-        <w:tc>
-          <w:tcPr>
-            <w:tcW w:type="dxa" w:w="2412"/>
-            <w:shd w:fill="F3F4F6" w:val="clear"/>
-          </w:tcPr>
-          <w:p>
-            <w:pPr>
-              <w:spacing w:before="40" w:after="40" w:line="259" w:lineRule="auto"/>
-            </w:pPr>
-            <w:r/>
-            <w:r>
-              <w:rPr>
-                <w:rFonts w:ascii="Calibri" w:hAnsi="Calibri" w:eastAsia="Calibri"/>
-                <w:b w:val="0"/>
-                <w:sz w:val="20"/>
-              </w:rPr>
-              <w:t xml:space="preserve">feature demo </w:t>
-            </w:r>
-            <w:r>
-              <w:rPr>
-                <w:rFonts w:ascii="Consolas" w:hAnsi="Consolas" w:eastAsia="Consolas"/>
-                <w:b w:val="0"/>
-                <w:color w:val="1E406E"/>
-                <w:sz w:val="20"/>
-              </w:rPr>
-              <w:t>stakeholderReview</w:t>
-            </w:r>
-          </w:p>
-        </w:tc>
-        <w:tc>
-          <w:tcPr>
-            <w:tcW w:type="dxa" w:w="2412"/>
-            <w:shd w:fill="F3F4F6" w:val="clear"/>
-          </w:tcPr>
-          <w:p>
-            <w:pPr>
-              <w:spacing w:before="40" w:after="40" w:line="259" w:lineRule="auto"/>
-            </w:pPr>
-            <w:r/>
-            <w:r>
-              <w:rPr>
-                <w:rFonts w:ascii="Calibri" w:hAnsi="Calibri" w:eastAsia="Calibri"/>
-                <w:b w:val="0"/>
-                <w:sz w:val="20"/>
-              </w:rPr>
-              <w:t>30s</w:t>
-            </w:r>
-          </w:p>
-        </w:tc>
-        <w:tc>
-          <w:tcPr>
-            <w:tcW w:type="dxa" w:w="2412"/>
-            <w:shd w:fill="F3F4F6" w:val="clear"/>
           </w:tcPr>
           <w:p>
             <w:pPr>

</xml_diff>